<commit_message>
Add rent comps, income approach and appeal data for 387 E 55th Ave
Workbook: five CoStar lease comps and rent tables on Lease Comps,
owner's 2023-2024 income/expense analysis, market rent linked into
the Income Approach, petitioner's nine sales on Basic Sales
Comparison, agent/appeal details, reconciliation notes.

Report: lease comparable table and rent discussion, rent roll with
owner-reported rent, income pro forma, petitioner's sales section,
fire extraordinary assumption, reconciliation text and values.

Co-Authored-By: Claude Opus 5.5 <noreply@anthropic.com>
Claude-Session: https://claude.ai/code/session_01UABrRYMaq1PG3KMVdDFsi1
</commit_message>
<xml_diff>
--- a/387_E_55th_Ave/Appraisal_Report_387_E_55th_Ave.docx
+++ b/387_E_55th_Ave/Appraisal_Report_387_E_55th_Ave.docx
@@ -616,6 +616,17 @@
     </w:p>
     <w:p>
       <w:pPr>
+        <w:spacing w:after="0"/>
+      </w:pPr>
+      <w:r>
+        <w:rPr>
+          <w:rFonts w:cs="Segoe UI"/>
+        </w:rPr>
+        <w:t xml:space="preserve">A structure fire occurred in the subject building (Unit B) on January 10, 2025 (Adams County Fire Rescue Case CR 25-0295), after the June 30, 2024 date of value but before the January 1, 2026 assessment date. Ownership reports $62,224 spent on repairs. We are valuing the subject under the Extraordinary Assumption that the fire damage was repaired and the improvements restored to average condition as of January 1, 2026. If found to be false, it could alter the appraiser’s opinions and/or conclusions.</w:t>
+      </w:r>
+    </w:p>
+    <w:p>
+      <w:pPr>
         <w:pStyle w:val="Heading20"/>
       </w:pPr>
       <w:r>
@@ -877,7 +888,7 @@
                 <w:szCs w:val="16"/>
                 <w:highlight w:val="yellow"/>
               </w:rPr>
-              <w:t xml:space="preserve">[pending]</w:t>
+              <w:t xml:space="preserve">Not stated</w:t>
             </w:r>
           </w:p>
         </w:tc>
@@ -896,9 +907,8 @@
                 <w:rFonts w:ascii="Arial" w:hAnsi="Arial" w:cs="Arial"/>
                 <w:sz w:val="16"/>
                 <w:szCs w:val="16"/>
-                <w:highlight w:val="yellow"/>
-              </w:rPr>
-              <w:t xml:space="preserve">[pending]</w:t>
+              </w:rPr>
+              <w:t xml:space="preserve"/>
             </w:r>
           </w:p>
         </w:tc>
@@ -5518,7 +5528,7 @@
     </w:p>
     <w:p>
       <w:r>
-        <w:t xml:space="preserve">The subject consists of a single light industrial service garage building consisting of 2,800 square feet of building area. The building provides free-span warehouse space with minimal office (approximately 176 SF) including a restroom and shower, two 12’ x 10’ drive-in doors with drive-through capability, epoxy-coated floors, evaporative (swamp) cooling and distributed air lines. The site includes approximately 2,500 SF of fenced yard for secure outdoor storage.</w:t>
+        <w:t xml:space="preserve">The subject consists of a single light industrial service garage building consisting of 2,800 square feet of building area. The building provides free-span warehouse space with minimal office (approximately 176 SF) including a restroom and shower, two 12’ x 10’ drive-in doors with drive-through capability, epoxy-coated floors, evaporative (swamp) cooling and distributed air lines. The site includes approximately 2,500 SF of fenced yard for secure outdoor storage. A structure fire occurred in Unit B on January 10, 2025 (ACFR Case CR 25-0295); ownership reports $62,224 in repairs, and the improvements are valued as repaired (see Extraordinary Assumptions).</w:t>
       </w:r>
     </w:p>
     <w:tbl>
@@ -18088,6 +18098,1967 @@
     </w:tbl>
     <w:p>
       <w:pPr>
+        <w:spacing w:before="0" w:after="0"/>
+      </w:pPr>
+    </w:p>
+    <w:p>
+      <w:pPr>
+        <w:spacing w:before="120" w:after="120"/>
+      </w:pPr>
+      <w:r>
+        <w:rPr>
+          <w:b/>
+          <w:sz w:val="24"/>
+        </w:rPr>
+        <w:t xml:space="preserve">Petitioner's Comparable Sales</w:t>
+      </w:r>
+    </w:p>
+    <w:p>
+      <w:pPr>
+        <w:spacing w:before="120" w:after="120"/>
+      </w:pPr>
+      <w:r>
+        <w:rPr>
+          <w:sz w:val="20"/>
+        </w:rPr>
+        <w:t xml:space="preserve">The petitioner submitted nine sales from a Colliers/CoStar report dated May 9, 2025, ranging from $205.68 to $454.29 per square foot unadjusted. Three of the sales (Nos. 1, 4 and 9) are also used in this analysis. Sales 2 and 3 closed after June 30, 2024 and fall outside the statutory data-gathering period (C.R.S. 39-1-104(10.2)(d)); Sale 1 is reported with a March 14, 2025 date by the petitioner, while the CoStar record relied on here shows the same $1,300,000 transaction on March 14, 2022. The six petitioner sales that closed within the data period indicate an average and median of approximately $309 per square foot before any adjustment for market conditions, location or physical differences; the south Denver, Englewood and Quebec Street sales are in inferior or less comparable industrial locations than the subject. The petitioner’s data therefore does not undermine the sales comparison conclusion above.</w:t>
+      </w:r>
+    </w:p>
+    <w:tbl>
+      <w:tblPr>
+        <w:tblW w:w="9360" w:type="dxa"/>
+        <w:jc w:val="center"/>
+        <w:tblBorders>
+          <w:top w:val="single" w:sz="4" w:space="0" w:color="BFBFBF"/>
+          <w:bottom w:val="single" w:sz="4" w:space="0" w:color="BFBFBF"/>
+          <w:insideH w:val="single" w:sz="2" w:space="0" w:color="D9D9D9"/>
+        </w:tblBorders>
+        <w:tblLayout w:type="fixed"/>
+        <w:tblCellMar>
+          <w:left w:w="60" w:type="dxa"/>
+          <w:right w:w="60" w:type="dxa"/>
+        </w:tblCellMar>
+      </w:tblPr>
+      <w:tblGrid>
+        <w:gridCol w:w="350"/>
+        <w:gridCol w:w="1700"/>
+        <w:gridCol w:w="1150"/>
+        <w:gridCol w:w="950"/>
+        <w:gridCol w:w="1050"/>
+        <w:gridCol w:w="700"/>
+        <w:gridCol w:w="850"/>
+        <w:gridCol w:w="600"/>
+        <w:gridCol w:w="2010"/>
+      </w:tblGrid>
+      <w:tr>
+        <w:trPr>
+          <w:cantSplit/>
+        </w:trPr>
+        <w:tc>
+          <w:tcPr>
+            <w:tcW w:w="9360" w:type="dxa"/>
+            <w:gridSpan w:val="9"/>
+            <w:shd w:val="clear" w:color="auto" w:fill="005710"/>
+            <w:vAlign w:val="center"/>
+          </w:tcPr>
+          <w:p>
+            <w:pPr>
+              <w:spacing w:before="0" w:after="0" w:line="240" w:lineRule="auto"/>
+              <w:jc w:val="center"/>
+            </w:pPr>
+            <w:r>
+              <w:rPr>
+                <w:rFonts w:ascii="Arial" w:hAnsi="Arial" w:cs="Arial"/>
+                <w:b/>
+                <w:color w:val="FFFFFF"/>
+                <w:sz w:val="16"/>
+                <w:szCs w:val="16"/>
+              </w:rPr>
+              <w:t xml:space="preserve">PETITIONER'S COMPARABLE SALES (Colliers / CoStar, 5/9/2025)</w:t>
+            </w:r>
+          </w:p>
+        </w:tc>
+      </w:tr>
+      <w:tr>
+        <w:trPr>
+          <w:cantSplit/>
+        </w:trPr>
+        <w:tc>
+          <w:tcPr>
+            <w:tcW w:w="350" w:type="dxa"/>
+            <w:shd w:val="clear" w:color="auto" w:fill="808080"/>
+            <w:vAlign w:val="center"/>
+          </w:tcPr>
+          <w:p>
+            <w:pPr>
+              <w:spacing w:before="0" w:after="0" w:line="240" w:lineRule="auto"/>
+              <w:jc w:val="center"/>
+            </w:pPr>
+            <w:r>
+              <w:rPr>
+                <w:rFonts w:ascii="Arial" w:hAnsi="Arial" w:cs="Arial"/>
+                <w:b/>
+                <w:color w:val="FFFFFF"/>
+                <w:sz w:val="14"/>
+                <w:szCs w:val="14"/>
+              </w:rPr>
+              <w:t xml:space="preserve">No.</w:t>
+            </w:r>
+          </w:p>
+        </w:tc>
+        <w:tc>
+          <w:tcPr>
+            <w:tcW w:w="1700" w:type="dxa"/>
+            <w:shd w:val="clear" w:color="auto" w:fill="808080"/>
+            <w:vAlign w:val="center"/>
+          </w:tcPr>
+          <w:p>
+            <w:pPr>
+              <w:spacing w:before="0" w:after="0" w:line="240" w:lineRule="auto"/>
+              <w:jc w:val="center"/>
+            </w:pPr>
+            <w:r>
+              <w:rPr>
+                <w:rFonts w:ascii="Arial" w:hAnsi="Arial" w:cs="Arial"/>
+                <w:b/>
+                <w:color w:val="FFFFFF"/>
+                <w:sz w:val="14"/>
+                <w:szCs w:val="14"/>
+              </w:rPr>
+              <w:t xml:space="preserve">Address</w:t>
+            </w:r>
+          </w:p>
+        </w:tc>
+        <w:tc>
+          <w:tcPr>
+            <w:tcW w:w="1150" w:type="dxa"/>
+            <w:shd w:val="clear" w:color="auto" w:fill="808080"/>
+            <w:vAlign w:val="center"/>
+          </w:tcPr>
+          <w:p>
+            <w:pPr>
+              <w:spacing w:before="0" w:after="0" w:line="240" w:lineRule="auto"/>
+              <w:jc w:val="center"/>
+            </w:pPr>
+            <w:r>
+              <w:rPr>
+                <w:rFonts w:ascii="Arial" w:hAnsi="Arial" w:cs="Arial"/>
+                <w:b/>
+                <w:color w:val="FFFFFF"/>
+                <w:sz w:val="14"/>
+                <w:szCs w:val="14"/>
+              </w:rPr>
+              <w:t xml:space="preserve">City</w:t>
+            </w:r>
+          </w:p>
+        </w:tc>
+        <w:tc>
+          <w:tcPr>
+            <w:tcW w:w="950" w:type="dxa"/>
+            <w:shd w:val="clear" w:color="auto" w:fill="808080"/>
+            <w:vAlign w:val="center"/>
+          </w:tcPr>
+          <w:p>
+            <w:pPr>
+              <w:spacing w:before="0" w:after="0" w:line="240" w:lineRule="auto"/>
+              <w:jc w:val="center"/>
+            </w:pPr>
+            <w:r>
+              <w:rPr>
+                <w:rFonts w:ascii="Arial" w:hAnsi="Arial" w:cs="Arial"/>
+                <w:b/>
+                <w:color w:val="FFFFFF"/>
+                <w:sz w:val="14"/>
+                <w:szCs w:val="14"/>
+              </w:rPr>
+              <w:t xml:space="preserve">Sale Date</w:t>
+            </w:r>
+          </w:p>
+        </w:tc>
+        <w:tc>
+          <w:tcPr>
+            <w:tcW w:w="1050" w:type="dxa"/>
+            <w:shd w:val="clear" w:color="auto" w:fill="808080"/>
+            <w:vAlign w:val="center"/>
+          </w:tcPr>
+          <w:p>
+            <w:pPr>
+              <w:spacing w:before="0" w:after="0" w:line="240" w:lineRule="auto"/>
+              <w:jc w:val="center"/>
+            </w:pPr>
+            <w:r>
+              <w:rPr>
+                <w:rFonts w:ascii="Arial" w:hAnsi="Arial" w:cs="Arial"/>
+                <w:b/>
+                <w:color w:val="FFFFFF"/>
+                <w:sz w:val="14"/>
+                <w:szCs w:val="14"/>
+              </w:rPr>
+              <w:t xml:space="preserve">Price</w:t>
+            </w:r>
+          </w:p>
+        </w:tc>
+        <w:tc>
+          <w:tcPr>
+            <w:tcW w:w="700" w:type="dxa"/>
+            <w:shd w:val="clear" w:color="auto" w:fill="808080"/>
+            <w:vAlign w:val="center"/>
+          </w:tcPr>
+          <w:p>
+            <w:pPr>
+              <w:spacing w:before="0" w:after="0" w:line="240" w:lineRule="auto"/>
+              <w:jc w:val="center"/>
+            </w:pPr>
+            <w:r>
+              <w:rPr>
+                <w:rFonts w:ascii="Arial" w:hAnsi="Arial" w:cs="Arial"/>
+                <w:b/>
+                <w:color w:val="FFFFFF"/>
+                <w:sz w:val="14"/>
+                <w:szCs w:val="14"/>
+              </w:rPr>
+              <w:t xml:space="preserve">SF</w:t>
+            </w:r>
+          </w:p>
+        </w:tc>
+        <w:tc>
+          <w:tcPr>
+            <w:tcW w:w="850" w:type="dxa"/>
+            <w:shd w:val="clear" w:color="auto" w:fill="808080"/>
+            <w:vAlign w:val="center"/>
+          </w:tcPr>
+          <w:p>
+            <w:pPr>
+              <w:spacing w:before="0" w:after="0" w:line="240" w:lineRule="auto"/>
+              <w:jc w:val="center"/>
+            </w:pPr>
+            <w:r>
+              <w:rPr>
+                <w:rFonts w:ascii="Arial" w:hAnsi="Arial" w:cs="Arial"/>
+                <w:b/>
+                <w:color w:val="FFFFFF"/>
+                <w:sz w:val="14"/>
+                <w:szCs w:val="14"/>
+              </w:rPr>
+              <w:t xml:space="preserve">$/SF</w:t>
+            </w:r>
+          </w:p>
+        </w:tc>
+        <w:tc>
+          <w:tcPr>
+            <w:tcW w:w="600" w:type="dxa"/>
+            <w:shd w:val="clear" w:color="auto" w:fill="808080"/>
+            <w:vAlign w:val="center"/>
+          </w:tcPr>
+          <w:p>
+            <w:pPr>
+              <w:spacing w:before="0" w:after="0" w:line="240" w:lineRule="auto"/>
+              <w:jc w:val="center"/>
+            </w:pPr>
+            <w:r>
+              <w:rPr>
+                <w:rFonts w:ascii="Arial" w:hAnsi="Arial" w:cs="Arial"/>
+                <w:b/>
+                <w:color w:val="FFFFFF"/>
+                <w:sz w:val="14"/>
+                <w:szCs w:val="14"/>
+              </w:rPr>
+              <w:t xml:space="preserve">Built</w:t>
+            </w:r>
+          </w:p>
+        </w:tc>
+        <w:tc>
+          <w:tcPr>
+            <w:tcW w:w="2010" w:type="dxa"/>
+            <w:shd w:val="clear" w:color="auto" w:fill="808080"/>
+            <w:vAlign w:val="center"/>
+          </w:tcPr>
+          <w:p>
+            <w:pPr>
+              <w:spacing w:before="0" w:after="0" w:line="240" w:lineRule="auto"/>
+              <w:jc w:val="center"/>
+            </w:pPr>
+            <w:r>
+              <w:rPr>
+                <w:rFonts w:ascii="Arial" w:hAnsi="Arial" w:cs="Arial"/>
+                <w:b/>
+                <w:color w:val="FFFFFF"/>
+                <w:sz w:val="14"/>
+                <w:szCs w:val="14"/>
+              </w:rPr>
+              <w:t xml:space="preserve">Comment</w:t>
+            </w:r>
+          </w:p>
+        </w:tc>
+      </w:tr>
+      <w:tr>
+        <w:trPr>
+          <w:cantSplit/>
+        </w:trPr>
+        <w:tc>
+          <w:tcPr>
+            <w:tcW w:w="350" w:type="dxa"/>
+            <w:vAlign w:val="center"/>
+          </w:tcPr>
+          <w:p>
+            <w:pPr>
+              <w:spacing w:before="0" w:after="0" w:line="240" w:lineRule="auto"/>
+              <w:jc w:val="center"/>
+            </w:pPr>
+            <w:r>
+              <w:rPr>
+                <w:rFonts w:ascii="Arial" w:hAnsi="Arial" w:cs="Arial"/>
+                <w:sz w:val="14"/>
+                <w:szCs w:val="14"/>
+              </w:rPr>
+              <w:t xml:space="preserve">1</w:t>
+            </w:r>
+          </w:p>
+        </w:tc>
+        <w:tc>
+          <w:tcPr>
+            <w:tcW w:w="1700" w:type="dxa"/>
+            <w:vAlign w:val="center"/>
+          </w:tcPr>
+          <w:p>
+            <w:pPr>
+              <w:spacing w:before="0" w:after="0" w:line="240" w:lineRule="auto"/>
+              <w:jc w:val="left"/>
+            </w:pPr>
+            <w:r>
+              <w:rPr>
+                <w:rFonts w:ascii="Arial" w:hAnsi="Arial" w:cs="Arial"/>
+                <w:sz w:val="14"/>
+                <w:szCs w:val="14"/>
+              </w:rPr>
+              <w:t xml:space="preserve">5350 Broadway</w:t>
+            </w:r>
+          </w:p>
+        </w:tc>
+        <w:tc>
+          <w:tcPr>
+            <w:tcW w:w="1150" w:type="dxa"/>
+            <w:vAlign w:val="center"/>
+          </w:tcPr>
+          <w:p>
+            <w:pPr>
+              <w:spacing w:before="0" w:after="0" w:line="240" w:lineRule="auto"/>
+              <w:jc w:val="left"/>
+            </w:pPr>
+            <w:r>
+              <w:rPr>
+                <w:rFonts w:ascii="Arial" w:hAnsi="Arial" w:cs="Arial"/>
+                <w:sz w:val="14"/>
+                <w:szCs w:val="14"/>
+              </w:rPr>
+              <w:t xml:space="preserve">Denver</w:t>
+            </w:r>
+          </w:p>
+        </w:tc>
+        <w:tc>
+          <w:tcPr>
+            <w:tcW w:w="950" w:type="dxa"/>
+            <w:vAlign w:val="center"/>
+          </w:tcPr>
+          <w:p>
+            <w:pPr>
+              <w:spacing w:before="0" w:after="0" w:line="240" w:lineRule="auto"/>
+              <w:jc w:val="center"/>
+            </w:pPr>
+            <w:r>
+              <w:rPr>
+                <w:rFonts w:ascii="Arial" w:hAnsi="Arial" w:cs="Arial"/>
+                <w:sz w:val="14"/>
+                <w:szCs w:val="14"/>
+              </w:rPr>
+              <w:t xml:space="preserve">3/14/2025</w:t>
+            </w:r>
+          </w:p>
+        </w:tc>
+        <w:tc>
+          <w:tcPr>
+            <w:tcW w:w="1050" w:type="dxa"/>
+            <w:vAlign w:val="center"/>
+          </w:tcPr>
+          <w:p>
+            <w:pPr>
+              <w:spacing w:before="0" w:after="0" w:line="240" w:lineRule="auto"/>
+              <w:jc w:val="right"/>
+            </w:pPr>
+            <w:r>
+              <w:rPr>
+                <w:rFonts w:ascii="Arial" w:hAnsi="Arial" w:cs="Arial"/>
+                <w:sz w:val="14"/>
+                <w:szCs w:val="14"/>
+              </w:rPr>
+              <w:t xml:space="preserve">$1,300,000</w:t>
+            </w:r>
+          </w:p>
+        </w:tc>
+        <w:tc>
+          <w:tcPr>
+            <w:tcW w:w="700" w:type="dxa"/>
+            <w:vAlign w:val="center"/>
+          </w:tcPr>
+          <w:p>
+            <w:pPr>
+              <w:spacing w:before="0" w:after="0" w:line="240" w:lineRule="auto"/>
+              <w:jc w:val="right"/>
+            </w:pPr>
+            <w:r>
+              <w:rPr>
+                <w:rFonts w:ascii="Arial" w:hAnsi="Arial" w:cs="Arial"/>
+                <w:sz w:val="14"/>
+                <w:szCs w:val="14"/>
+              </w:rPr>
+              <w:t xml:space="preserve">3,500</w:t>
+            </w:r>
+          </w:p>
+        </w:tc>
+        <w:tc>
+          <w:tcPr>
+            <w:tcW w:w="850" w:type="dxa"/>
+            <w:vAlign w:val="center"/>
+          </w:tcPr>
+          <w:p>
+            <w:pPr>
+              <w:spacing w:before="0" w:after="0" w:line="240" w:lineRule="auto"/>
+              <w:jc w:val="right"/>
+            </w:pPr>
+            <w:r>
+              <w:rPr>
+                <w:rFonts w:ascii="Arial" w:hAnsi="Arial" w:cs="Arial"/>
+                <w:sz w:val="14"/>
+                <w:szCs w:val="14"/>
+              </w:rPr>
+              <w:t xml:space="preserve">$371.43</w:t>
+            </w:r>
+          </w:p>
+        </w:tc>
+        <w:tc>
+          <w:tcPr>
+            <w:tcW w:w="600" w:type="dxa"/>
+            <w:vAlign w:val="center"/>
+          </w:tcPr>
+          <w:p>
+            <w:pPr>
+              <w:spacing w:before="0" w:after="0" w:line="240" w:lineRule="auto"/>
+              <w:jc w:val="center"/>
+            </w:pPr>
+            <w:r>
+              <w:rPr>
+                <w:rFonts w:ascii="Arial" w:hAnsi="Arial" w:cs="Arial"/>
+                <w:sz w:val="14"/>
+                <w:szCs w:val="14"/>
+              </w:rPr>
+              <w:t xml:space="preserve">1971</w:t>
+            </w:r>
+          </w:p>
+        </w:tc>
+        <w:tc>
+          <w:tcPr>
+            <w:tcW w:w="2010" w:type="dxa"/>
+            <w:vAlign w:val="center"/>
+          </w:tcPr>
+          <w:p>
+            <w:pPr>
+              <w:spacing w:before="0" w:after="0" w:line="240" w:lineRule="auto"/>
+              <w:jc w:val="left"/>
+            </w:pPr>
+            <w:r>
+              <w:rPr>
+                <w:rFonts w:ascii="Arial" w:hAnsi="Arial" w:cs="Arial"/>
+                <w:sz w:val="14"/>
+                <w:szCs w:val="14"/>
+              </w:rPr>
+              <w:t xml:space="preserve">Our Sale 8 (CoStar shows 3/14/2022)</w:t>
+            </w:r>
+          </w:p>
+        </w:tc>
+      </w:tr>
+      <w:tr>
+        <w:trPr>
+          <w:cantSplit/>
+        </w:trPr>
+        <w:tc>
+          <w:tcPr>
+            <w:tcW w:w="350" w:type="dxa"/>
+            <w:vAlign w:val="center"/>
+          </w:tcPr>
+          <w:p>
+            <w:pPr>
+              <w:spacing w:before="0" w:after="0" w:line="240" w:lineRule="auto"/>
+              <w:jc w:val="center"/>
+            </w:pPr>
+            <w:r>
+              <w:rPr>
+                <w:rFonts w:ascii="Arial" w:hAnsi="Arial" w:cs="Arial"/>
+                <w:sz w:val="14"/>
+                <w:szCs w:val="14"/>
+              </w:rPr>
+              <w:t xml:space="preserve">2</w:t>
+            </w:r>
+          </w:p>
+        </w:tc>
+        <w:tc>
+          <w:tcPr>
+            <w:tcW w:w="1700" w:type="dxa"/>
+            <w:vAlign w:val="center"/>
+          </w:tcPr>
+          <w:p>
+            <w:pPr>
+              <w:spacing w:before="0" w:after="0" w:line="240" w:lineRule="auto"/>
+              <w:jc w:val="left"/>
+            </w:pPr>
+            <w:r>
+              <w:rPr>
+                <w:rFonts w:ascii="Arial" w:hAnsi="Arial" w:cs="Arial"/>
+                <w:sz w:val="14"/>
+                <w:szCs w:val="14"/>
+              </w:rPr>
+              <w:t xml:space="preserve">1482 W Maple Ave</w:t>
+            </w:r>
+          </w:p>
+        </w:tc>
+        <w:tc>
+          <w:tcPr>
+            <w:tcW w:w="1150" w:type="dxa"/>
+            <w:vAlign w:val="center"/>
+          </w:tcPr>
+          <w:p>
+            <w:pPr>
+              <w:spacing w:before="0" w:after="0" w:line="240" w:lineRule="auto"/>
+              <w:jc w:val="left"/>
+            </w:pPr>
+            <w:r>
+              <w:rPr>
+                <w:rFonts w:ascii="Arial" w:hAnsi="Arial" w:cs="Arial"/>
+                <w:sz w:val="14"/>
+                <w:szCs w:val="14"/>
+              </w:rPr>
+              <w:t xml:space="preserve">Denver</w:t>
+            </w:r>
+          </w:p>
+        </w:tc>
+        <w:tc>
+          <w:tcPr>
+            <w:tcW w:w="950" w:type="dxa"/>
+            <w:vAlign w:val="center"/>
+          </w:tcPr>
+          <w:p>
+            <w:pPr>
+              <w:spacing w:before="0" w:after="0" w:line="240" w:lineRule="auto"/>
+              <w:jc w:val="center"/>
+            </w:pPr>
+            <w:r>
+              <w:rPr>
+                <w:rFonts w:ascii="Arial" w:hAnsi="Arial" w:cs="Arial"/>
+                <w:sz w:val="14"/>
+                <w:szCs w:val="14"/>
+              </w:rPr>
+              <w:t xml:space="preserve">4/25/2025</w:t>
+            </w:r>
+          </w:p>
+        </w:tc>
+        <w:tc>
+          <w:tcPr>
+            <w:tcW w:w="1050" w:type="dxa"/>
+            <w:vAlign w:val="center"/>
+          </w:tcPr>
+          <w:p>
+            <w:pPr>
+              <w:spacing w:before="0" w:after="0" w:line="240" w:lineRule="auto"/>
+              <w:jc w:val="right"/>
+            </w:pPr>
+            <w:r>
+              <w:rPr>
+                <w:rFonts w:ascii="Arial" w:hAnsi="Arial" w:cs="Arial"/>
+                <w:sz w:val="14"/>
+                <w:szCs w:val="14"/>
+              </w:rPr>
+              <w:t xml:space="preserve">$880,000</w:t>
+            </w:r>
+          </w:p>
+        </w:tc>
+        <w:tc>
+          <w:tcPr>
+            <w:tcW w:w="700" w:type="dxa"/>
+            <w:vAlign w:val="center"/>
+          </w:tcPr>
+          <w:p>
+            <w:pPr>
+              <w:spacing w:before="0" w:after="0" w:line="240" w:lineRule="auto"/>
+              <w:jc w:val="right"/>
+            </w:pPr>
+            <w:r>
+              <w:rPr>
+                <w:rFonts w:ascii="Arial" w:hAnsi="Arial" w:cs="Arial"/>
+                <w:sz w:val="14"/>
+                <w:szCs w:val="14"/>
+              </w:rPr>
+              <w:t xml:space="preserve">3,136</w:t>
+            </w:r>
+          </w:p>
+        </w:tc>
+        <w:tc>
+          <w:tcPr>
+            <w:tcW w:w="850" w:type="dxa"/>
+            <w:vAlign w:val="center"/>
+          </w:tcPr>
+          <w:p>
+            <w:pPr>
+              <w:spacing w:before="0" w:after="0" w:line="240" w:lineRule="auto"/>
+              <w:jc w:val="right"/>
+            </w:pPr>
+            <w:r>
+              <w:rPr>
+                <w:rFonts w:ascii="Arial" w:hAnsi="Arial" w:cs="Arial"/>
+                <w:sz w:val="14"/>
+                <w:szCs w:val="14"/>
+              </w:rPr>
+              <w:t xml:space="preserve">$280.61</w:t>
+            </w:r>
+          </w:p>
+        </w:tc>
+        <w:tc>
+          <w:tcPr>
+            <w:tcW w:w="600" w:type="dxa"/>
+            <w:vAlign w:val="center"/>
+          </w:tcPr>
+          <w:p>
+            <w:pPr>
+              <w:spacing w:before="0" w:after="0" w:line="240" w:lineRule="auto"/>
+              <w:jc w:val="center"/>
+            </w:pPr>
+            <w:r>
+              <w:rPr>
+                <w:rFonts w:ascii="Arial" w:hAnsi="Arial" w:cs="Arial"/>
+                <w:sz w:val="14"/>
+                <w:szCs w:val="14"/>
+              </w:rPr>
+              <w:t xml:space="preserve">1982</w:t>
+            </w:r>
+          </w:p>
+        </w:tc>
+        <w:tc>
+          <w:tcPr>
+            <w:tcW w:w="2010" w:type="dxa"/>
+            <w:vAlign w:val="center"/>
+          </w:tcPr>
+          <w:p>
+            <w:pPr>
+              <w:spacing w:before="0" w:after="0" w:line="240" w:lineRule="auto"/>
+              <w:jc w:val="left"/>
+            </w:pPr>
+            <w:r>
+              <w:rPr>
+                <w:rFonts w:ascii="Arial" w:hAnsi="Arial" w:cs="Arial"/>
+                <w:sz w:val="14"/>
+                <w:szCs w:val="14"/>
+              </w:rPr>
+              <w:t xml:space="preserve">After data period</w:t>
+            </w:r>
+          </w:p>
+        </w:tc>
+      </w:tr>
+      <w:tr>
+        <w:trPr>
+          <w:cantSplit/>
+        </w:trPr>
+        <w:tc>
+          <w:tcPr>
+            <w:tcW w:w="350" w:type="dxa"/>
+            <w:vAlign w:val="center"/>
+          </w:tcPr>
+          <w:p>
+            <w:pPr>
+              <w:spacing w:before="0" w:after="0" w:line="240" w:lineRule="auto"/>
+              <w:jc w:val="center"/>
+            </w:pPr>
+            <w:r>
+              <w:rPr>
+                <w:rFonts w:ascii="Arial" w:hAnsi="Arial" w:cs="Arial"/>
+                <w:sz w:val="14"/>
+                <w:szCs w:val="14"/>
+              </w:rPr>
+              <w:t xml:space="preserve">3</w:t>
+            </w:r>
+          </w:p>
+        </w:tc>
+        <w:tc>
+          <w:tcPr>
+            <w:tcW w:w="1700" w:type="dxa"/>
+            <w:vAlign w:val="center"/>
+          </w:tcPr>
+          <w:p>
+            <w:pPr>
+              <w:spacing w:before="0" w:after="0" w:line="240" w:lineRule="auto"/>
+              <w:jc w:val="left"/>
+            </w:pPr>
+            <w:r>
+              <w:rPr>
+                <w:rFonts w:ascii="Arial" w:hAnsi="Arial" w:cs="Arial"/>
+                <w:sz w:val="14"/>
+                <w:szCs w:val="14"/>
+              </w:rPr>
+              <w:t xml:space="preserve">1920 E 44th Ave</w:t>
+            </w:r>
+          </w:p>
+        </w:tc>
+        <w:tc>
+          <w:tcPr>
+            <w:tcW w:w="1150" w:type="dxa"/>
+            <w:vAlign w:val="center"/>
+          </w:tcPr>
+          <w:p>
+            <w:pPr>
+              <w:spacing w:before="0" w:after="0" w:line="240" w:lineRule="auto"/>
+              <w:jc w:val="left"/>
+            </w:pPr>
+            <w:r>
+              <w:rPr>
+                <w:rFonts w:ascii="Arial" w:hAnsi="Arial" w:cs="Arial"/>
+                <w:sz w:val="14"/>
+                <w:szCs w:val="14"/>
+              </w:rPr>
+              <w:t xml:space="preserve">Denver</w:t>
+            </w:r>
+          </w:p>
+        </w:tc>
+        <w:tc>
+          <w:tcPr>
+            <w:tcW w:w="950" w:type="dxa"/>
+            <w:vAlign w:val="center"/>
+          </w:tcPr>
+          <w:p>
+            <w:pPr>
+              <w:spacing w:before="0" w:after="0" w:line="240" w:lineRule="auto"/>
+              <w:jc w:val="center"/>
+            </w:pPr>
+            <w:r>
+              <w:rPr>
+                <w:rFonts w:ascii="Arial" w:hAnsi="Arial" w:cs="Arial"/>
+                <w:sz w:val="14"/>
+                <w:szCs w:val="14"/>
+              </w:rPr>
+              <w:t xml:space="preserve">11/27/2024</w:t>
+            </w:r>
+          </w:p>
+        </w:tc>
+        <w:tc>
+          <w:tcPr>
+            <w:tcW w:w="1050" w:type="dxa"/>
+            <w:vAlign w:val="center"/>
+          </w:tcPr>
+          <w:p>
+            <w:pPr>
+              <w:spacing w:before="0" w:after="0" w:line="240" w:lineRule="auto"/>
+              <w:jc w:val="right"/>
+            </w:pPr>
+            <w:r>
+              <w:rPr>
+                <w:rFonts w:ascii="Arial" w:hAnsi="Arial" w:cs="Arial"/>
+                <w:sz w:val="14"/>
+                <w:szCs w:val="14"/>
+              </w:rPr>
+              <w:t xml:space="preserve">$800,000</w:t>
+            </w:r>
+          </w:p>
+        </w:tc>
+        <w:tc>
+          <w:tcPr>
+            <w:tcW w:w="700" w:type="dxa"/>
+            <w:vAlign w:val="center"/>
+          </w:tcPr>
+          <w:p>
+            <w:pPr>
+              <w:spacing w:before="0" w:after="0" w:line="240" w:lineRule="auto"/>
+              <w:jc w:val="right"/>
+            </w:pPr>
+            <w:r>
+              <w:rPr>
+                <w:rFonts w:ascii="Arial" w:hAnsi="Arial" w:cs="Arial"/>
+                <w:sz w:val="14"/>
+                <w:szCs w:val="14"/>
+              </w:rPr>
+              <w:t xml:space="preserve">2,178</w:t>
+            </w:r>
+          </w:p>
+        </w:tc>
+        <w:tc>
+          <w:tcPr>
+            <w:tcW w:w="850" w:type="dxa"/>
+            <w:vAlign w:val="center"/>
+          </w:tcPr>
+          <w:p>
+            <w:pPr>
+              <w:spacing w:before="0" w:after="0" w:line="240" w:lineRule="auto"/>
+              <w:jc w:val="right"/>
+            </w:pPr>
+            <w:r>
+              <w:rPr>
+                <w:rFonts w:ascii="Arial" w:hAnsi="Arial" w:cs="Arial"/>
+                <w:sz w:val="14"/>
+                <w:szCs w:val="14"/>
+              </w:rPr>
+              <w:t xml:space="preserve">$367.31</w:t>
+            </w:r>
+          </w:p>
+        </w:tc>
+        <w:tc>
+          <w:tcPr>
+            <w:tcW w:w="600" w:type="dxa"/>
+            <w:vAlign w:val="center"/>
+          </w:tcPr>
+          <w:p>
+            <w:pPr>
+              <w:spacing w:before="0" w:after="0" w:line="240" w:lineRule="auto"/>
+              <w:jc w:val="center"/>
+            </w:pPr>
+            <w:r>
+              <w:rPr>
+                <w:rFonts w:ascii="Arial" w:hAnsi="Arial" w:cs="Arial"/>
+                <w:sz w:val="14"/>
+                <w:szCs w:val="14"/>
+              </w:rPr>
+              <w:t xml:space="preserve">1972</w:t>
+            </w:r>
+          </w:p>
+        </w:tc>
+        <w:tc>
+          <w:tcPr>
+            <w:tcW w:w="2010" w:type="dxa"/>
+            <w:vAlign w:val="center"/>
+          </w:tcPr>
+          <w:p>
+            <w:pPr>
+              <w:spacing w:before="0" w:after="0" w:line="240" w:lineRule="auto"/>
+              <w:jc w:val="left"/>
+            </w:pPr>
+            <w:r>
+              <w:rPr>
+                <w:rFonts w:ascii="Arial" w:hAnsi="Arial" w:cs="Arial"/>
+                <w:sz w:val="14"/>
+                <w:szCs w:val="14"/>
+              </w:rPr>
+              <w:t xml:space="preserve">After data period</w:t>
+            </w:r>
+          </w:p>
+        </w:tc>
+      </w:tr>
+      <w:tr>
+        <w:trPr>
+          <w:cantSplit/>
+        </w:trPr>
+        <w:tc>
+          <w:tcPr>
+            <w:tcW w:w="350" w:type="dxa"/>
+            <w:vAlign w:val="center"/>
+          </w:tcPr>
+          <w:p>
+            <w:pPr>
+              <w:spacing w:before="0" w:after="0" w:line="240" w:lineRule="auto"/>
+              <w:jc w:val="center"/>
+            </w:pPr>
+            <w:r>
+              <w:rPr>
+                <w:rFonts w:ascii="Arial" w:hAnsi="Arial" w:cs="Arial"/>
+                <w:sz w:val="14"/>
+                <w:szCs w:val="14"/>
+              </w:rPr>
+              <w:t xml:space="preserve">4</w:t>
+            </w:r>
+          </w:p>
+        </w:tc>
+        <w:tc>
+          <w:tcPr>
+            <w:tcW w:w="1700" w:type="dxa"/>
+            <w:vAlign w:val="center"/>
+          </w:tcPr>
+          <w:p>
+            <w:pPr>
+              <w:spacing w:before="0" w:after="0" w:line="240" w:lineRule="auto"/>
+              <w:jc w:val="left"/>
+            </w:pPr>
+            <w:r>
+              <w:rPr>
+                <w:rFonts w:ascii="Arial" w:hAnsi="Arial" w:cs="Arial"/>
+                <w:sz w:val="14"/>
+                <w:szCs w:val="14"/>
+              </w:rPr>
+              <w:t xml:space="preserve">4161 Elati St</w:t>
+            </w:r>
+          </w:p>
+        </w:tc>
+        <w:tc>
+          <w:tcPr>
+            <w:tcW w:w="1150" w:type="dxa"/>
+            <w:vAlign w:val="center"/>
+          </w:tcPr>
+          <w:p>
+            <w:pPr>
+              <w:spacing w:before="0" w:after="0" w:line="240" w:lineRule="auto"/>
+              <w:jc w:val="left"/>
+            </w:pPr>
+            <w:r>
+              <w:rPr>
+                <w:rFonts w:ascii="Arial" w:hAnsi="Arial" w:cs="Arial"/>
+                <w:sz w:val="14"/>
+                <w:szCs w:val="14"/>
+              </w:rPr>
+              <w:t xml:space="preserve">Denver</w:t>
+            </w:r>
+          </w:p>
+        </w:tc>
+        <w:tc>
+          <w:tcPr>
+            <w:tcW w:w="950" w:type="dxa"/>
+            <w:vAlign w:val="center"/>
+          </w:tcPr>
+          <w:p>
+            <w:pPr>
+              <w:spacing w:before="0" w:after="0" w:line="240" w:lineRule="auto"/>
+              <w:jc w:val="center"/>
+            </w:pPr>
+            <w:r>
+              <w:rPr>
+                <w:rFonts w:ascii="Arial" w:hAnsi="Arial" w:cs="Arial"/>
+                <w:sz w:val="14"/>
+                <w:szCs w:val="14"/>
+              </w:rPr>
+              <w:t xml:space="preserve">5/10/2024</w:t>
+            </w:r>
+          </w:p>
+        </w:tc>
+        <w:tc>
+          <w:tcPr>
+            <w:tcW w:w="1050" w:type="dxa"/>
+            <w:vAlign w:val="center"/>
+          </w:tcPr>
+          <w:p>
+            <w:pPr>
+              <w:spacing w:before="0" w:after="0" w:line="240" w:lineRule="auto"/>
+              <w:jc w:val="right"/>
+            </w:pPr>
+            <w:r>
+              <w:rPr>
+                <w:rFonts w:ascii="Arial" w:hAnsi="Arial" w:cs="Arial"/>
+                <w:sz w:val="14"/>
+                <w:szCs w:val="14"/>
+              </w:rPr>
+              <w:t xml:space="preserve">$900,000</w:t>
+            </w:r>
+          </w:p>
+        </w:tc>
+        <w:tc>
+          <w:tcPr>
+            <w:tcW w:w="700" w:type="dxa"/>
+            <w:vAlign w:val="center"/>
+          </w:tcPr>
+          <w:p>
+            <w:pPr>
+              <w:spacing w:before="0" w:after="0" w:line="240" w:lineRule="auto"/>
+              <w:jc w:val="right"/>
+            </w:pPr>
+            <w:r>
+              <w:rPr>
+                <w:rFonts w:ascii="Arial" w:hAnsi="Arial" w:cs="Arial"/>
+                <w:sz w:val="14"/>
+                <w:szCs w:val="14"/>
+              </w:rPr>
+              <w:t xml:space="preserve">3,003</w:t>
+            </w:r>
+          </w:p>
+        </w:tc>
+        <w:tc>
+          <w:tcPr>
+            <w:tcW w:w="850" w:type="dxa"/>
+            <w:vAlign w:val="center"/>
+          </w:tcPr>
+          <w:p>
+            <w:pPr>
+              <w:spacing w:before="0" w:after="0" w:line="240" w:lineRule="auto"/>
+              <w:jc w:val="right"/>
+            </w:pPr>
+            <w:r>
+              <w:rPr>
+                <w:rFonts w:ascii="Arial" w:hAnsi="Arial" w:cs="Arial"/>
+                <w:sz w:val="14"/>
+                <w:szCs w:val="14"/>
+              </w:rPr>
+              <w:t xml:space="preserve">$299.70</w:t>
+            </w:r>
+          </w:p>
+        </w:tc>
+        <w:tc>
+          <w:tcPr>
+            <w:tcW w:w="600" w:type="dxa"/>
+            <w:vAlign w:val="center"/>
+          </w:tcPr>
+          <w:p>
+            <w:pPr>
+              <w:spacing w:before="0" w:after="0" w:line="240" w:lineRule="auto"/>
+              <w:jc w:val="center"/>
+            </w:pPr>
+            <w:r>
+              <w:rPr>
+                <w:rFonts w:ascii="Arial" w:hAnsi="Arial" w:cs="Arial"/>
+                <w:sz w:val="14"/>
+                <w:szCs w:val="14"/>
+              </w:rPr>
+              <w:t xml:space="preserve">1987</w:t>
+            </w:r>
+          </w:p>
+        </w:tc>
+        <w:tc>
+          <w:tcPr>
+            <w:tcW w:w="2010" w:type="dxa"/>
+            <w:vAlign w:val="center"/>
+          </w:tcPr>
+          <w:p>
+            <w:pPr>
+              <w:spacing w:before="0" w:after="0" w:line="240" w:lineRule="auto"/>
+              <w:jc w:val="left"/>
+            </w:pPr>
+            <w:r>
+              <w:rPr>
+                <w:rFonts w:ascii="Arial" w:hAnsi="Arial" w:cs="Arial"/>
+                <w:sz w:val="14"/>
+                <w:szCs w:val="14"/>
+              </w:rPr>
+              <w:t xml:space="preserve">Our Sale 2</w:t>
+            </w:r>
+          </w:p>
+        </w:tc>
+      </w:tr>
+      <w:tr>
+        <w:trPr>
+          <w:cantSplit/>
+        </w:trPr>
+        <w:tc>
+          <w:tcPr>
+            <w:tcW w:w="350" w:type="dxa"/>
+            <w:vAlign w:val="center"/>
+          </w:tcPr>
+          <w:p>
+            <w:pPr>
+              <w:spacing w:before="0" w:after="0" w:line="240" w:lineRule="auto"/>
+              <w:jc w:val="center"/>
+            </w:pPr>
+            <w:r>
+              <w:rPr>
+                <w:rFonts w:ascii="Arial" w:hAnsi="Arial" w:cs="Arial"/>
+                <w:sz w:val="14"/>
+                <w:szCs w:val="14"/>
+              </w:rPr>
+              <w:t xml:space="preserve">5</w:t>
+            </w:r>
+          </w:p>
+        </w:tc>
+        <w:tc>
+          <w:tcPr>
+            <w:tcW w:w="1700" w:type="dxa"/>
+            <w:vAlign w:val="center"/>
+          </w:tcPr>
+          <w:p>
+            <w:pPr>
+              <w:spacing w:before="0" w:after="0" w:line="240" w:lineRule="auto"/>
+              <w:jc w:val="left"/>
+            </w:pPr>
+            <w:r>
+              <w:rPr>
+                <w:rFonts w:ascii="Arial" w:hAnsi="Arial" w:cs="Arial"/>
+                <w:sz w:val="14"/>
+                <w:szCs w:val="14"/>
+              </w:rPr>
+              <w:t xml:space="preserve">2200 S Fox St</w:t>
+            </w:r>
+          </w:p>
+        </w:tc>
+        <w:tc>
+          <w:tcPr>
+            <w:tcW w:w="1150" w:type="dxa"/>
+            <w:vAlign w:val="center"/>
+          </w:tcPr>
+          <w:p>
+            <w:pPr>
+              <w:spacing w:before="0" w:after="0" w:line="240" w:lineRule="auto"/>
+              <w:jc w:val="left"/>
+            </w:pPr>
+            <w:r>
+              <w:rPr>
+                <w:rFonts w:ascii="Arial" w:hAnsi="Arial" w:cs="Arial"/>
+                <w:sz w:val="14"/>
+                <w:szCs w:val="14"/>
+              </w:rPr>
+              <w:t xml:space="preserve">Denver</w:t>
+            </w:r>
+          </w:p>
+        </w:tc>
+        <w:tc>
+          <w:tcPr>
+            <w:tcW w:w="950" w:type="dxa"/>
+            <w:vAlign w:val="center"/>
+          </w:tcPr>
+          <w:p>
+            <w:pPr>
+              <w:spacing w:before="0" w:after="0" w:line="240" w:lineRule="auto"/>
+              <w:jc w:val="center"/>
+            </w:pPr>
+            <w:r>
+              <w:rPr>
+                <w:rFonts w:ascii="Arial" w:hAnsi="Arial" w:cs="Arial"/>
+                <w:sz w:val="14"/>
+                <w:szCs w:val="14"/>
+              </w:rPr>
+              <w:t xml:space="preserve">5/4/2024</w:t>
+            </w:r>
+          </w:p>
+        </w:tc>
+        <w:tc>
+          <w:tcPr>
+            <w:tcW w:w="1050" w:type="dxa"/>
+            <w:vAlign w:val="center"/>
+          </w:tcPr>
+          <w:p>
+            <w:pPr>
+              <w:spacing w:before="0" w:after="0" w:line="240" w:lineRule="auto"/>
+              <w:jc w:val="right"/>
+            </w:pPr>
+            <w:r>
+              <w:rPr>
+                <w:rFonts w:ascii="Arial" w:hAnsi="Arial" w:cs="Arial"/>
+                <w:sz w:val="14"/>
+                <w:szCs w:val="14"/>
+              </w:rPr>
+              <w:t xml:space="preserve">$740,000</w:t>
+            </w:r>
+          </w:p>
+        </w:tc>
+        <w:tc>
+          <w:tcPr>
+            <w:tcW w:w="700" w:type="dxa"/>
+            <w:vAlign w:val="center"/>
+          </w:tcPr>
+          <w:p>
+            <w:pPr>
+              <w:spacing w:before="0" w:after="0" w:line="240" w:lineRule="auto"/>
+              <w:jc w:val="right"/>
+            </w:pPr>
+            <w:r>
+              <w:rPr>
+                <w:rFonts w:ascii="Arial" w:hAnsi="Arial" w:cs="Arial"/>
+                <w:sz w:val="14"/>
+                <w:szCs w:val="14"/>
+              </w:rPr>
+              <w:t xml:space="preserve">3,136</w:t>
+            </w:r>
+          </w:p>
+        </w:tc>
+        <w:tc>
+          <w:tcPr>
+            <w:tcW w:w="850" w:type="dxa"/>
+            <w:vAlign w:val="center"/>
+          </w:tcPr>
+          <w:p>
+            <w:pPr>
+              <w:spacing w:before="0" w:after="0" w:line="240" w:lineRule="auto"/>
+              <w:jc w:val="right"/>
+            </w:pPr>
+            <w:r>
+              <w:rPr>
+                <w:rFonts w:ascii="Arial" w:hAnsi="Arial" w:cs="Arial"/>
+                <w:sz w:val="14"/>
+                <w:szCs w:val="14"/>
+              </w:rPr>
+              <w:t xml:space="preserve">$235.97</w:t>
+            </w:r>
+          </w:p>
+        </w:tc>
+        <w:tc>
+          <w:tcPr>
+            <w:tcW w:w="600" w:type="dxa"/>
+            <w:vAlign w:val="center"/>
+          </w:tcPr>
+          <w:p>
+            <w:pPr>
+              <w:spacing w:before="0" w:after="0" w:line="240" w:lineRule="auto"/>
+              <w:jc w:val="center"/>
+            </w:pPr>
+            <w:r>
+              <w:rPr>
+                <w:rFonts w:ascii="Arial" w:hAnsi="Arial" w:cs="Arial"/>
+                <w:sz w:val="14"/>
+                <w:szCs w:val="14"/>
+              </w:rPr>
+              <w:t xml:space="preserve">1981</w:t>
+            </w:r>
+          </w:p>
+        </w:tc>
+        <w:tc>
+          <w:tcPr>
+            <w:tcW w:w="2010" w:type="dxa"/>
+            <w:vAlign w:val="center"/>
+          </w:tcPr>
+          <w:p>
+            <w:pPr>
+              <w:spacing w:before="0" w:after="0" w:line="240" w:lineRule="auto"/>
+              <w:jc w:val="left"/>
+            </w:pPr>
+            <w:r>
+              <w:rPr>
+                <w:rFonts w:ascii="Arial" w:hAnsi="Arial" w:cs="Arial"/>
+                <w:sz w:val="14"/>
+                <w:szCs w:val="14"/>
+              </w:rPr>
+              <w:t xml:space="preserve">South Denver</w:t>
+            </w:r>
+          </w:p>
+        </w:tc>
+      </w:tr>
+      <w:tr>
+        <w:trPr>
+          <w:cantSplit/>
+        </w:trPr>
+        <w:tc>
+          <w:tcPr>
+            <w:tcW w:w="350" w:type="dxa"/>
+            <w:vAlign w:val="center"/>
+          </w:tcPr>
+          <w:p>
+            <w:pPr>
+              <w:spacing w:before="0" w:after="0" w:line="240" w:lineRule="auto"/>
+              <w:jc w:val="center"/>
+            </w:pPr>
+            <w:r>
+              <w:rPr>
+                <w:rFonts w:ascii="Arial" w:hAnsi="Arial" w:cs="Arial"/>
+                <w:sz w:val="14"/>
+                <w:szCs w:val="14"/>
+              </w:rPr>
+              <w:t xml:space="preserve">6</w:t>
+            </w:r>
+          </w:p>
+        </w:tc>
+        <w:tc>
+          <w:tcPr>
+            <w:tcW w:w="1700" w:type="dxa"/>
+            <w:vAlign w:val="center"/>
+          </w:tcPr>
+          <w:p>
+            <w:pPr>
+              <w:spacing w:before="0" w:after="0" w:line="240" w:lineRule="auto"/>
+              <w:jc w:val="left"/>
+            </w:pPr>
+            <w:r>
+              <w:rPr>
+                <w:rFonts w:ascii="Arial" w:hAnsi="Arial" w:cs="Arial"/>
+                <w:sz w:val="14"/>
+                <w:szCs w:val="14"/>
+              </w:rPr>
+              <w:t xml:space="preserve">5470 Newport St</w:t>
+            </w:r>
+          </w:p>
+        </w:tc>
+        <w:tc>
+          <w:tcPr>
+            <w:tcW w:w="1150" w:type="dxa"/>
+            <w:vAlign w:val="center"/>
+          </w:tcPr>
+          <w:p>
+            <w:pPr>
+              <w:spacing w:before="0" w:after="0" w:line="240" w:lineRule="auto"/>
+              <w:jc w:val="left"/>
+            </w:pPr>
+            <w:r>
+              <w:rPr>
+                <w:rFonts w:ascii="Arial" w:hAnsi="Arial" w:cs="Arial"/>
+                <w:sz w:val="14"/>
+                <w:szCs w:val="14"/>
+              </w:rPr>
+              <w:t xml:space="preserve">Commerce City</w:t>
+            </w:r>
+          </w:p>
+        </w:tc>
+        <w:tc>
+          <w:tcPr>
+            <w:tcW w:w="950" w:type="dxa"/>
+            <w:vAlign w:val="center"/>
+          </w:tcPr>
+          <w:p>
+            <w:pPr>
+              <w:spacing w:before="0" w:after="0" w:line="240" w:lineRule="auto"/>
+              <w:jc w:val="center"/>
+            </w:pPr>
+            <w:r>
+              <w:rPr>
+                <w:rFonts w:ascii="Arial" w:hAnsi="Arial" w:cs="Arial"/>
+                <w:sz w:val="14"/>
+                <w:szCs w:val="14"/>
+              </w:rPr>
+              <w:t xml:space="preserve">4/26/2024</w:t>
+            </w:r>
+          </w:p>
+        </w:tc>
+        <w:tc>
+          <w:tcPr>
+            <w:tcW w:w="1050" w:type="dxa"/>
+            <w:vAlign w:val="center"/>
+          </w:tcPr>
+          <w:p>
+            <w:pPr>
+              <w:spacing w:before="0" w:after="0" w:line="240" w:lineRule="auto"/>
+              <w:jc w:val="right"/>
+            </w:pPr>
+            <w:r>
+              <w:rPr>
+                <w:rFonts w:ascii="Arial" w:hAnsi="Arial" w:cs="Arial"/>
+                <w:sz w:val="14"/>
+                <w:szCs w:val="14"/>
+              </w:rPr>
+              <w:t xml:space="preserve">$795,000</w:t>
+            </w:r>
+          </w:p>
+        </w:tc>
+        <w:tc>
+          <w:tcPr>
+            <w:tcW w:w="700" w:type="dxa"/>
+            <w:vAlign w:val="center"/>
+          </w:tcPr>
+          <w:p>
+            <w:pPr>
+              <w:spacing w:before="0" w:after="0" w:line="240" w:lineRule="auto"/>
+              <w:jc w:val="right"/>
+            </w:pPr>
+            <w:r>
+              <w:rPr>
+                <w:rFonts w:ascii="Arial" w:hAnsi="Arial" w:cs="Arial"/>
+                <w:sz w:val="14"/>
+                <w:szCs w:val="14"/>
+              </w:rPr>
+              <w:t xml:space="preserve">1,750</w:t>
+            </w:r>
+          </w:p>
+        </w:tc>
+        <w:tc>
+          <w:tcPr>
+            <w:tcW w:w="850" w:type="dxa"/>
+            <w:vAlign w:val="center"/>
+          </w:tcPr>
+          <w:p>
+            <w:pPr>
+              <w:spacing w:before="0" w:after="0" w:line="240" w:lineRule="auto"/>
+              <w:jc w:val="right"/>
+            </w:pPr>
+            <w:r>
+              <w:rPr>
+                <w:rFonts w:ascii="Arial" w:hAnsi="Arial" w:cs="Arial"/>
+                <w:sz w:val="14"/>
+                <w:szCs w:val="14"/>
+              </w:rPr>
+              <w:t xml:space="preserve">$454.29</w:t>
+            </w:r>
+          </w:p>
+        </w:tc>
+        <w:tc>
+          <w:tcPr>
+            <w:tcW w:w="600" w:type="dxa"/>
+            <w:vAlign w:val="center"/>
+          </w:tcPr>
+          <w:p>
+            <w:pPr>
+              <w:spacing w:before="0" w:after="0" w:line="240" w:lineRule="auto"/>
+              <w:jc w:val="center"/>
+            </w:pPr>
+            <w:r>
+              <w:rPr>
+                <w:rFonts w:ascii="Arial" w:hAnsi="Arial" w:cs="Arial"/>
+                <w:sz w:val="14"/>
+                <w:szCs w:val="14"/>
+              </w:rPr>
+              <w:t xml:space="preserve">1983</w:t>
+            </w:r>
+          </w:p>
+        </w:tc>
+        <w:tc>
+          <w:tcPr>
+            <w:tcW w:w="2010" w:type="dxa"/>
+            <w:vAlign w:val="center"/>
+          </w:tcPr>
+          <w:p>
+            <w:pPr>
+              <w:spacing w:before="0" w:after="0" w:line="240" w:lineRule="auto"/>
+              <w:jc w:val="left"/>
+            </w:pPr>
+            <w:r>
+              <w:rPr>
+                <w:rFonts w:ascii="Arial" w:hAnsi="Arial" w:cs="Arial"/>
+                <w:sz w:val="14"/>
+                <w:szCs w:val="14"/>
+              </w:rPr>
+              <w:t xml:space="preserve">Renovated 2020; smaller</w:t>
+            </w:r>
+          </w:p>
+        </w:tc>
+      </w:tr>
+      <w:tr>
+        <w:trPr>
+          <w:cantSplit/>
+        </w:trPr>
+        <w:tc>
+          <w:tcPr>
+            <w:tcW w:w="350" w:type="dxa"/>
+            <w:vAlign w:val="center"/>
+          </w:tcPr>
+          <w:p>
+            <w:pPr>
+              <w:spacing w:before="0" w:after="0" w:line="240" w:lineRule="auto"/>
+              <w:jc w:val="center"/>
+            </w:pPr>
+            <w:r>
+              <w:rPr>
+                <w:rFonts w:ascii="Arial" w:hAnsi="Arial" w:cs="Arial"/>
+                <w:sz w:val="14"/>
+                <w:szCs w:val="14"/>
+              </w:rPr>
+              <w:t xml:space="preserve">7</w:t>
+            </w:r>
+          </w:p>
+        </w:tc>
+        <w:tc>
+          <w:tcPr>
+            <w:tcW w:w="1700" w:type="dxa"/>
+            <w:vAlign w:val="center"/>
+          </w:tcPr>
+          <w:p>
+            <w:pPr>
+              <w:spacing w:before="0" w:after="0" w:line="240" w:lineRule="auto"/>
+              <w:jc w:val="left"/>
+            </w:pPr>
+            <w:r>
+              <w:rPr>
+                <w:rFonts w:ascii="Arial" w:hAnsi="Arial" w:cs="Arial"/>
+                <w:sz w:val="14"/>
+                <w:szCs w:val="14"/>
+              </w:rPr>
+              <w:t xml:space="preserve">3978 Ulster St</w:t>
+            </w:r>
+          </w:p>
+        </w:tc>
+        <w:tc>
+          <w:tcPr>
+            <w:tcW w:w="1150" w:type="dxa"/>
+            <w:vAlign w:val="center"/>
+          </w:tcPr>
+          <w:p>
+            <w:pPr>
+              <w:spacing w:before="0" w:after="0" w:line="240" w:lineRule="auto"/>
+              <w:jc w:val="left"/>
+            </w:pPr>
+            <w:r>
+              <w:rPr>
+                <w:rFonts w:ascii="Arial" w:hAnsi="Arial" w:cs="Arial"/>
+                <w:sz w:val="14"/>
+                <w:szCs w:val="14"/>
+              </w:rPr>
+              <w:t xml:space="preserve">Denver</w:t>
+            </w:r>
+          </w:p>
+        </w:tc>
+        <w:tc>
+          <w:tcPr>
+            <w:tcW w:w="950" w:type="dxa"/>
+            <w:vAlign w:val="center"/>
+          </w:tcPr>
+          <w:p>
+            <w:pPr>
+              <w:spacing w:before="0" w:after="0" w:line="240" w:lineRule="auto"/>
+              <w:jc w:val="center"/>
+            </w:pPr>
+            <w:r>
+              <w:rPr>
+                <w:rFonts w:ascii="Arial" w:hAnsi="Arial" w:cs="Arial"/>
+                <w:sz w:val="14"/>
+                <w:szCs w:val="14"/>
+              </w:rPr>
+              <w:t xml:space="preserve">4/25/2024</w:t>
+            </w:r>
+          </w:p>
+        </w:tc>
+        <w:tc>
+          <w:tcPr>
+            <w:tcW w:w="1050" w:type="dxa"/>
+            <w:vAlign w:val="center"/>
+          </w:tcPr>
+          <w:p>
+            <w:pPr>
+              <w:spacing w:before="0" w:after="0" w:line="240" w:lineRule="auto"/>
+              <w:jc w:val="right"/>
+            </w:pPr>
+            <w:r>
+              <w:rPr>
+                <w:rFonts w:ascii="Arial" w:hAnsi="Arial" w:cs="Arial"/>
+                <w:sz w:val="14"/>
+                <w:szCs w:val="14"/>
+              </w:rPr>
+              <w:t xml:space="preserve">$775,000</w:t>
+            </w:r>
+          </w:p>
+        </w:tc>
+        <w:tc>
+          <w:tcPr>
+            <w:tcW w:w="700" w:type="dxa"/>
+            <w:vAlign w:val="center"/>
+          </w:tcPr>
+          <w:p>
+            <w:pPr>
+              <w:spacing w:before="0" w:after="0" w:line="240" w:lineRule="auto"/>
+              <w:jc w:val="right"/>
+            </w:pPr>
+            <w:r>
+              <w:rPr>
+                <w:rFonts w:ascii="Arial" w:hAnsi="Arial" w:cs="Arial"/>
+                <w:sz w:val="14"/>
+                <w:szCs w:val="14"/>
+              </w:rPr>
+              <w:t xml:space="preserve">3,768</w:t>
+            </w:r>
+          </w:p>
+        </w:tc>
+        <w:tc>
+          <w:tcPr>
+            <w:tcW w:w="850" w:type="dxa"/>
+            <w:vAlign w:val="center"/>
+          </w:tcPr>
+          <w:p>
+            <w:pPr>
+              <w:spacing w:before="0" w:after="0" w:line="240" w:lineRule="auto"/>
+              <w:jc w:val="right"/>
+            </w:pPr>
+            <w:r>
+              <w:rPr>
+                <w:rFonts w:ascii="Arial" w:hAnsi="Arial" w:cs="Arial"/>
+                <w:sz w:val="14"/>
+                <w:szCs w:val="14"/>
+              </w:rPr>
+              <w:t xml:space="preserve">$205.68</w:t>
+            </w:r>
+          </w:p>
+        </w:tc>
+        <w:tc>
+          <w:tcPr>
+            <w:tcW w:w="600" w:type="dxa"/>
+            <w:vAlign w:val="center"/>
+          </w:tcPr>
+          <w:p>
+            <w:pPr>
+              <w:spacing w:before="0" w:after="0" w:line="240" w:lineRule="auto"/>
+              <w:jc w:val="center"/>
+            </w:pPr>
+            <w:r>
+              <w:rPr>
+                <w:rFonts w:ascii="Arial" w:hAnsi="Arial" w:cs="Arial"/>
+                <w:sz w:val="14"/>
+                <w:szCs w:val="14"/>
+              </w:rPr>
+              <w:t xml:space="preserve">1962</w:t>
+            </w:r>
+          </w:p>
+        </w:tc>
+        <w:tc>
+          <w:tcPr>
+            <w:tcW w:w="2010" w:type="dxa"/>
+            <w:vAlign w:val="center"/>
+          </w:tcPr>
+          <w:p>
+            <w:pPr>
+              <w:spacing w:before="0" w:after="0" w:line="240" w:lineRule="auto"/>
+              <w:jc w:val="left"/>
+            </w:pPr>
+            <w:r>
+              <w:rPr>
+                <w:rFonts w:ascii="Arial" w:hAnsi="Arial" w:cs="Arial"/>
+                <w:sz w:val="14"/>
+                <w:szCs w:val="14"/>
+              </w:rPr>
+              <w:t xml:space="preserve">Quebec St submarket</w:t>
+            </w:r>
+          </w:p>
+        </w:tc>
+      </w:tr>
+      <w:tr>
+        <w:trPr>
+          <w:cantSplit/>
+        </w:trPr>
+        <w:tc>
+          <w:tcPr>
+            <w:tcW w:w="350" w:type="dxa"/>
+            <w:vAlign w:val="center"/>
+          </w:tcPr>
+          <w:p>
+            <w:pPr>
+              <w:spacing w:before="0" w:after="0" w:line="240" w:lineRule="auto"/>
+              <w:jc w:val="center"/>
+            </w:pPr>
+            <w:r>
+              <w:rPr>
+                <w:rFonts w:ascii="Arial" w:hAnsi="Arial" w:cs="Arial"/>
+                <w:sz w:val="14"/>
+                <w:szCs w:val="14"/>
+              </w:rPr>
+              <w:t xml:space="preserve">8</w:t>
+            </w:r>
+          </w:p>
+        </w:tc>
+        <w:tc>
+          <w:tcPr>
+            <w:tcW w:w="1700" w:type="dxa"/>
+            <w:vAlign w:val="center"/>
+          </w:tcPr>
+          <w:p>
+            <w:pPr>
+              <w:spacing w:before="0" w:after="0" w:line="240" w:lineRule="auto"/>
+              <w:jc w:val="left"/>
+            </w:pPr>
+            <w:r>
+              <w:rPr>
+                <w:rFonts w:ascii="Arial" w:hAnsi="Arial" w:cs="Arial"/>
+                <w:sz w:val="14"/>
+                <w:szCs w:val="14"/>
+              </w:rPr>
+              <w:t xml:space="preserve">3159 S Zuni St</w:t>
+            </w:r>
+          </w:p>
+        </w:tc>
+        <w:tc>
+          <w:tcPr>
+            <w:tcW w:w="1150" w:type="dxa"/>
+            <w:vAlign w:val="center"/>
+          </w:tcPr>
+          <w:p>
+            <w:pPr>
+              <w:spacing w:before="0" w:after="0" w:line="240" w:lineRule="auto"/>
+              <w:jc w:val="left"/>
+            </w:pPr>
+            <w:r>
+              <w:rPr>
+                <w:rFonts w:ascii="Arial" w:hAnsi="Arial" w:cs="Arial"/>
+                <w:sz w:val="14"/>
+                <w:szCs w:val="14"/>
+              </w:rPr>
+              <w:t xml:space="preserve">Englewood</w:t>
+            </w:r>
+          </w:p>
+        </w:tc>
+        <w:tc>
+          <w:tcPr>
+            <w:tcW w:w="950" w:type="dxa"/>
+            <w:vAlign w:val="center"/>
+          </w:tcPr>
+          <w:p>
+            <w:pPr>
+              <w:spacing w:before="0" w:after="0" w:line="240" w:lineRule="auto"/>
+              <w:jc w:val="center"/>
+            </w:pPr>
+            <w:r>
+              <w:rPr>
+                <w:rFonts w:ascii="Arial" w:hAnsi="Arial" w:cs="Arial"/>
+                <w:sz w:val="14"/>
+                <w:szCs w:val="14"/>
+              </w:rPr>
+              <w:t xml:space="preserve">4/22/2024</w:t>
+            </w:r>
+          </w:p>
+        </w:tc>
+        <w:tc>
+          <w:tcPr>
+            <w:tcW w:w="1050" w:type="dxa"/>
+            <w:vAlign w:val="center"/>
+          </w:tcPr>
+          <w:p>
+            <w:pPr>
+              <w:spacing w:before="0" w:after="0" w:line="240" w:lineRule="auto"/>
+              <w:jc w:val="right"/>
+            </w:pPr>
+            <w:r>
+              <w:rPr>
+                <w:rFonts w:ascii="Arial" w:hAnsi="Arial" w:cs="Arial"/>
+                <w:sz w:val="14"/>
+                <w:szCs w:val="14"/>
+              </w:rPr>
+              <w:t xml:space="preserve">$850,000</w:t>
+            </w:r>
+          </w:p>
+        </w:tc>
+        <w:tc>
+          <w:tcPr>
+            <w:tcW w:w="700" w:type="dxa"/>
+            <w:vAlign w:val="center"/>
+          </w:tcPr>
+          <w:p>
+            <w:pPr>
+              <w:spacing w:before="0" w:after="0" w:line="240" w:lineRule="auto"/>
+              <w:jc w:val="right"/>
+            </w:pPr>
+            <w:r>
+              <w:rPr>
+                <w:rFonts w:ascii="Arial" w:hAnsi="Arial" w:cs="Arial"/>
+                <w:sz w:val="14"/>
+                <w:szCs w:val="14"/>
+              </w:rPr>
+              <w:t xml:space="preserve">2,500</w:t>
+            </w:r>
+          </w:p>
+        </w:tc>
+        <w:tc>
+          <w:tcPr>
+            <w:tcW w:w="850" w:type="dxa"/>
+            <w:vAlign w:val="center"/>
+          </w:tcPr>
+          <w:p>
+            <w:pPr>
+              <w:spacing w:before="0" w:after="0" w:line="240" w:lineRule="auto"/>
+              <w:jc w:val="right"/>
+            </w:pPr>
+            <w:r>
+              <w:rPr>
+                <w:rFonts w:ascii="Arial" w:hAnsi="Arial" w:cs="Arial"/>
+                <w:sz w:val="14"/>
+                <w:szCs w:val="14"/>
+              </w:rPr>
+              <w:t xml:space="preserve">$340.00</w:t>
+            </w:r>
+          </w:p>
+        </w:tc>
+        <w:tc>
+          <w:tcPr>
+            <w:tcW w:w="600" w:type="dxa"/>
+            <w:vAlign w:val="center"/>
+          </w:tcPr>
+          <w:p>
+            <w:pPr>
+              <w:spacing w:before="0" w:after="0" w:line="240" w:lineRule="auto"/>
+              <w:jc w:val="center"/>
+            </w:pPr>
+            <w:r>
+              <w:rPr>
+                <w:rFonts w:ascii="Arial" w:hAnsi="Arial" w:cs="Arial"/>
+                <w:sz w:val="14"/>
+                <w:szCs w:val="14"/>
+              </w:rPr>
+              <w:t xml:space="preserve">1977</w:t>
+            </w:r>
+          </w:p>
+        </w:tc>
+        <w:tc>
+          <w:tcPr>
+            <w:tcW w:w="2010" w:type="dxa"/>
+            <w:vAlign w:val="center"/>
+          </w:tcPr>
+          <w:p>
+            <w:pPr>
+              <w:spacing w:before="0" w:after="0" w:line="240" w:lineRule="auto"/>
+              <w:jc w:val="left"/>
+            </w:pPr>
+            <w:r>
+              <w:rPr>
+                <w:rFonts w:ascii="Arial" w:hAnsi="Arial" w:cs="Arial"/>
+                <w:sz w:val="14"/>
+                <w:szCs w:val="14"/>
+              </w:rPr>
+              <w:t xml:space="preserve">South metro</w:t>
+            </w:r>
+          </w:p>
+        </w:tc>
+      </w:tr>
+      <w:tr>
+        <w:trPr>
+          <w:cantSplit/>
+        </w:trPr>
+        <w:tc>
+          <w:tcPr>
+            <w:tcW w:w="350" w:type="dxa"/>
+            <w:vAlign w:val="center"/>
+          </w:tcPr>
+          <w:p>
+            <w:pPr>
+              <w:spacing w:before="0" w:after="0" w:line="240" w:lineRule="auto"/>
+              <w:jc w:val="center"/>
+            </w:pPr>
+            <w:r>
+              <w:rPr>
+                <w:rFonts w:ascii="Arial" w:hAnsi="Arial" w:cs="Arial"/>
+                <w:sz w:val="14"/>
+                <w:szCs w:val="14"/>
+              </w:rPr>
+              <w:t xml:space="preserve">9</w:t>
+            </w:r>
+          </w:p>
+        </w:tc>
+        <w:tc>
+          <w:tcPr>
+            <w:tcW w:w="1700" w:type="dxa"/>
+            <w:vAlign w:val="center"/>
+          </w:tcPr>
+          <w:p>
+            <w:pPr>
+              <w:spacing w:before="0" w:after="0" w:line="240" w:lineRule="auto"/>
+              <w:jc w:val="left"/>
+            </w:pPr>
+            <w:r>
+              <w:rPr>
+                <w:rFonts w:ascii="Arial" w:hAnsi="Arial" w:cs="Arial"/>
+                <w:sz w:val="14"/>
+                <w:szCs w:val="14"/>
+              </w:rPr>
+              <w:t xml:space="preserve">5690 Lamar St</w:t>
+            </w:r>
+          </w:p>
+        </w:tc>
+        <w:tc>
+          <w:tcPr>
+            <w:tcW w:w="1150" w:type="dxa"/>
+            <w:vAlign w:val="center"/>
+          </w:tcPr>
+          <w:p>
+            <w:pPr>
+              <w:spacing w:before="0" w:after="0" w:line="240" w:lineRule="auto"/>
+              <w:jc w:val="left"/>
+            </w:pPr>
+            <w:r>
+              <w:rPr>
+                <w:rFonts w:ascii="Arial" w:hAnsi="Arial" w:cs="Arial"/>
+                <w:sz w:val="14"/>
+                <w:szCs w:val="14"/>
+              </w:rPr>
+              <w:t xml:space="preserve">Arvada</w:t>
+            </w:r>
+          </w:p>
+        </w:tc>
+        <w:tc>
+          <w:tcPr>
+            <w:tcW w:w="950" w:type="dxa"/>
+            <w:vAlign w:val="center"/>
+          </w:tcPr>
+          <w:p>
+            <w:pPr>
+              <w:spacing w:before="0" w:after="0" w:line="240" w:lineRule="auto"/>
+              <w:jc w:val="center"/>
+            </w:pPr>
+            <w:r>
+              <w:rPr>
+                <w:rFonts w:ascii="Arial" w:hAnsi="Arial" w:cs="Arial"/>
+                <w:sz w:val="14"/>
+                <w:szCs w:val="14"/>
+              </w:rPr>
+              <w:t xml:space="preserve">3/18/2024</w:t>
+            </w:r>
+          </w:p>
+        </w:tc>
+        <w:tc>
+          <w:tcPr>
+            <w:tcW w:w="1050" w:type="dxa"/>
+            <w:vAlign w:val="center"/>
+          </w:tcPr>
+          <w:p>
+            <w:pPr>
+              <w:spacing w:before="0" w:after="0" w:line="240" w:lineRule="auto"/>
+              <w:jc w:val="right"/>
+            </w:pPr>
+            <w:r>
+              <w:rPr>
+                <w:rFonts w:ascii="Arial" w:hAnsi="Arial" w:cs="Arial"/>
+                <w:sz w:val="14"/>
+                <w:szCs w:val="14"/>
+              </w:rPr>
+              <w:t xml:space="preserve">$1,000,000</w:t>
+            </w:r>
+          </w:p>
+        </w:tc>
+        <w:tc>
+          <w:tcPr>
+            <w:tcW w:w="700" w:type="dxa"/>
+            <w:vAlign w:val="center"/>
+          </w:tcPr>
+          <w:p>
+            <w:pPr>
+              <w:spacing w:before="0" w:after="0" w:line="240" w:lineRule="auto"/>
+              <w:jc w:val="right"/>
+            </w:pPr>
+            <w:r>
+              <w:rPr>
+                <w:rFonts w:ascii="Arial" w:hAnsi="Arial" w:cs="Arial"/>
+                <w:sz w:val="14"/>
+                <w:szCs w:val="14"/>
+              </w:rPr>
+              <w:t xml:space="preserve">3,143</w:t>
+            </w:r>
+          </w:p>
+        </w:tc>
+        <w:tc>
+          <w:tcPr>
+            <w:tcW w:w="850" w:type="dxa"/>
+            <w:vAlign w:val="center"/>
+          </w:tcPr>
+          <w:p>
+            <w:pPr>
+              <w:spacing w:before="0" w:after="0" w:line="240" w:lineRule="auto"/>
+              <w:jc w:val="right"/>
+            </w:pPr>
+            <w:r>
+              <w:rPr>
+                <w:rFonts w:ascii="Arial" w:hAnsi="Arial" w:cs="Arial"/>
+                <w:sz w:val="14"/>
+                <w:szCs w:val="14"/>
+              </w:rPr>
+              <w:t xml:space="preserve">$318.17</w:t>
+            </w:r>
+          </w:p>
+        </w:tc>
+        <w:tc>
+          <w:tcPr>
+            <w:tcW w:w="600" w:type="dxa"/>
+            <w:vAlign w:val="center"/>
+          </w:tcPr>
+          <w:p>
+            <w:pPr>
+              <w:spacing w:before="0" w:after="0" w:line="240" w:lineRule="auto"/>
+              <w:jc w:val="center"/>
+            </w:pPr>
+            <w:r>
+              <w:rPr>
+                <w:rFonts w:ascii="Arial" w:hAnsi="Arial" w:cs="Arial"/>
+                <w:sz w:val="14"/>
+                <w:szCs w:val="14"/>
+              </w:rPr>
+              <w:t xml:space="preserve">1969</w:t>
+            </w:r>
+          </w:p>
+        </w:tc>
+        <w:tc>
+          <w:tcPr>
+            <w:tcW w:w="2010" w:type="dxa"/>
+            <w:vAlign w:val="center"/>
+          </w:tcPr>
+          <w:p>
+            <w:pPr>
+              <w:spacing w:before="0" w:after="0" w:line="240" w:lineRule="auto"/>
+              <w:jc w:val="left"/>
+            </w:pPr>
+            <w:r>
+              <w:rPr>
+                <w:rFonts w:ascii="Arial" w:hAnsi="Arial" w:cs="Arial"/>
+                <w:sz w:val="14"/>
+                <w:szCs w:val="14"/>
+              </w:rPr>
+              <w:t xml:space="preserve">Our Sale 4</w:t>
+            </w:r>
+          </w:p>
+        </w:tc>
+      </w:tr>
+    </w:tbl>
+    <w:p>
+      <w:pPr>
         <w:sectPr>
           <w:pgSz w:w="12240" w:h="15840"/>
           <w:pgMar w:top="1440" w:right="1440" w:bottom="1440" w:left="1440" w:header="720" w:footer="720" w:gutter="0"/>
@@ -18350,7 +20321,7 @@
                 <w:sz w:val="15"/>
                 <w:szCs w:val="15"/>
               </w:rPr>
-              <w:t xml:space="preserve">Not provided</w:t>
+              <w:t xml:space="preserve">$19.82 ($4,625/mo)</w:t>
             </w:r>
           </w:p>
         </w:tc>
@@ -18370,7 +20341,7 @@
                 <w:sz w:val="15"/>
                 <w:szCs w:val="15"/>
               </w:rPr>
-              <w:t xml:space="preserve">N/A</w:t>
+              <w:t xml:space="preserve">Gross*</w:t>
             </w:r>
           </w:p>
         </w:tc>
@@ -18415,6 +20386,33 @@
           </w:p>
         </w:tc>
       </w:tr>
+      <w:tr>
+        <w:trPr>
+          <w:cantSplit/>
+        </w:trPr>
+        <w:tc>
+          <w:tcPr>
+            <w:tcW w:w="7200" w:type="dxa"/>
+            <w:gridSpan w:val="5"/>
+            <w:vAlign w:val="center"/>
+          </w:tcPr>
+          <w:p>
+            <w:pPr>
+              <w:spacing w:before="0" w:after="0" w:line="240" w:lineRule="auto"/>
+              <w:jc w:val="left"/>
+            </w:pPr>
+            <w:r>
+              <w:rPr>
+                <w:rFonts w:ascii="Arial" w:hAnsi="Arial" w:cs="Arial"/>
+                <w:i/>
+                <w:sz w:val="13"/>
+                <w:szCs w:val="13"/>
+              </w:rPr>
+              <w:t xml:space="preserve">*Per owner (2024); landlord pays taxes, insurance and water/sewer. No written lease supplied.</w:t>
+            </w:r>
+          </w:p>
+        </w:tc>
+      </w:tr>
     </w:tbl>
     <w:p>
       <w:pPr>
@@ -18422,18 +20420,1550 @@
       </w:pPr>
     </w:p>
     <w:p/>
-    <w:p>
-      <w:pPr>
-        <w:spacing w:before="120" w:after="120"/>
-      </w:pPr>
-      <w:r>
-        <w:rPr>
-          <w:sz w:val="20"/>
-          <w:highlight w:val="yellow"/>
-        </w:rPr>
-        <w:t xml:space="preserve">[Lease comparables table – pending receipt of the rent comparables]</w:t>
-      </w:r>
-    </w:p>
+    <w:tbl>
+      <w:tblPr>
+        <w:tblW w:w="9260" w:type="dxa"/>
+        <w:jc w:val="center"/>
+        <w:tblBorders>
+          <w:top w:val="single" w:sz="4" w:space="0" w:color="BFBFBF"/>
+          <w:bottom w:val="single" w:sz="4" w:space="0" w:color="BFBFBF"/>
+          <w:insideH w:val="single" w:sz="2" w:space="0" w:color="D9D9D9"/>
+        </w:tblBorders>
+        <w:tblLayout w:type="fixed"/>
+        <w:tblCellMar>
+          <w:left w:w="60" w:type="dxa"/>
+          <w:right w:w="60" w:type="dxa"/>
+        </w:tblCellMar>
+      </w:tblPr>
+      <w:tblGrid>
+        <w:gridCol w:w="350"/>
+        <w:gridCol w:w="2150"/>
+        <w:gridCol w:w="1000"/>
+        <w:gridCol w:w="900"/>
+        <w:gridCol w:w="850"/>
+        <w:gridCol w:w="700"/>
+        <w:gridCol w:w="650"/>
+        <w:gridCol w:w="700"/>
+        <w:gridCol w:w="950"/>
+        <w:gridCol w:w="1010"/>
+      </w:tblGrid>
+      <w:tr>
+        <w:trPr>
+          <w:cantSplit/>
+        </w:trPr>
+        <w:tc>
+          <w:tcPr>
+            <w:tcW w:w="9260" w:type="dxa"/>
+            <w:gridSpan w:val="10"/>
+            <w:shd w:val="clear" w:color="auto" w:fill="005710"/>
+            <w:vAlign w:val="center"/>
+          </w:tcPr>
+          <w:p>
+            <w:pPr>
+              <w:spacing w:before="0" w:after="0" w:line="240" w:lineRule="auto"/>
+              <w:jc w:val="center"/>
+            </w:pPr>
+            <w:r>
+              <w:rPr>
+                <w:rFonts w:ascii="Arial" w:hAnsi="Arial" w:cs="Arial"/>
+                <w:b/>
+                <w:color w:val="FFFFFF"/>
+                <w:sz w:val="16"/>
+                <w:szCs w:val="16"/>
+              </w:rPr>
+              <w:t xml:space="preserve">Lease Comparables</w:t>
+            </w:r>
+          </w:p>
+        </w:tc>
+      </w:tr>
+      <w:tr>
+        <w:trPr>
+          <w:cantSplit/>
+        </w:trPr>
+        <w:tc>
+          <w:tcPr>
+            <w:tcW w:w="350" w:type="dxa"/>
+            <w:shd w:val="clear" w:color="auto" w:fill="808080"/>
+            <w:vAlign w:val="center"/>
+          </w:tcPr>
+          <w:p>
+            <w:pPr>
+              <w:spacing w:before="0" w:after="0" w:line="240" w:lineRule="auto"/>
+              <w:jc w:val="center"/>
+            </w:pPr>
+            <w:r>
+              <w:rPr>
+                <w:rFonts w:ascii="Arial" w:hAnsi="Arial" w:cs="Arial"/>
+                <w:b/>
+                <w:color w:val="FFFFFF"/>
+                <w:sz w:val="14"/>
+                <w:szCs w:val="14"/>
+              </w:rPr>
+              <w:t xml:space="preserve">No.</w:t>
+            </w:r>
+          </w:p>
+        </w:tc>
+        <w:tc>
+          <w:tcPr>
+            <w:tcW w:w="2150" w:type="dxa"/>
+            <w:shd w:val="clear" w:color="auto" w:fill="808080"/>
+            <w:vAlign w:val="center"/>
+          </w:tcPr>
+          <w:p>
+            <w:pPr>
+              <w:spacing w:before="0" w:after="0" w:line="240" w:lineRule="auto"/>
+              <w:jc w:val="center"/>
+            </w:pPr>
+            <w:r>
+              <w:rPr>
+                <w:rFonts w:ascii="Arial" w:hAnsi="Arial" w:cs="Arial"/>
+                <w:b/>
+                <w:color w:val="FFFFFF"/>
+                <w:sz w:val="14"/>
+                <w:szCs w:val="14"/>
+              </w:rPr>
+              <w:t xml:space="preserve">Address</w:t>
+            </w:r>
+          </w:p>
+        </w:tc>
+        <w:tc>
+          <w:tcPr>
+            <w:tcW w:w="1000" w:type="dxa"/>
+            <w:shd w:val="clear" w:color="auto" w:fill="808080"/>
+            <w:vAlign w:val="center"/>
+          </w:tcPr>
+          <w:p>
+            <w:pPr>
+              <w:spacing w:before="0" w:after="0" w:line="240" w:lineRule="auto"/>
+              <w:jc w:val="center"/>
+            </w:pPr>
+            <w:r>
+              <w:rPr>
+                <w:rFonts w:ascii="Arial" w:hAnsi="Arial" w:cs="Arial"/>
+                <w:b/>
+                <w:color w:val="FFFFFF"/>
+                <w:sz w:val="14"/>
+                <w:szCs w:val="14"/>
+              </w:rPr>
+              <w:t xml:space="preserve">City</w:t>
+            </w:r>
+          </w:p>
+        </w:tc>
+        <w:tc>
+          <w:tcPr>
+            <w:tcW w:w="900" w:type="dxa"/>
+            <w:shd w:val="clear" w:color="auto" w:fill="808080"/>
+            <w:vAlign w:val="center"/>
+          </w:tcPr>
+          <w:p>
+            <w:pPr>
+              <w:spacing w:before="0" w:after="0" w:line="240" w:lineRule="auto"/>
+              <w:jc w:val="center"/>
+            </w:pPr>
+            <w:r>
+              <w:rPr>
+                <w:rFonts w:ascii="Arial" w:hAnsi="Arial" w:cs="Arial"/>
+                <w:b/>
+                <w:color w:val="FFFFFF"/>
+                <w:sz w:val="14"/>
+                <w:szCs w:val="14"/>
+              </w:rPr>
+              <w:t xml:space="preserve">Signed</w:t>
+            </w:r>
+          </w:p>
+        </w:tc>
+        <w:tc>
+          <w:tcPr>
+            <w:tcW w:w="850" w:type="dxa"/>
+            <w:shd w:val="clear" w:color="auto" w:fill="808080"/>
+            <w:vAlign w:val="center"/>
+          </w:tcPr>
+          <w:p>
+            <w:pPr>
+              <w:spacing w:before="0" w:after="0" w:line="240" w:lineRule="auto"/>
+              <w:jc w:val="center"/>
+            </w:pPr>
+            <w:r>
+              <w:rPr>
+                <w:rFonts w:ascii="Arial" w:hAnsi="Arial" w:cs="Arial"/>
+                <w:b/>
+                <w:color w:val="FFFFFF"/>
+                <w:sz w:val="14"/>
+                <w:szCs w:val="14"/>
+              </w:rPr>
+              <w:t xml:space="preserve">Use</w:t>
+            </w:r>
+          </w:p>
+        </w:tc>
+        <w:tc>
+          <w:tcPr>
+            <w:tcW w:w="700" w:type="dxa"/>
+            <w:shd w:val="clear" w:color="auto" w:fill="808080"/>
+            <w:vAlign w:val="center"/>
+          </w:tcPr>
+          <w:p>
+            <w:pPr>
+              <w:spacing w:before="0" w:after="0" w:line="240" w:lineRule="auto"/>
+              <w:jc w:val="center"/>
+            </w:pPr>
+            <w:r>
+              <w:rPr>
+                <w:rFonts w:ascii="Arial" w:hAnsi="Arial" w:cs="Arial"/>
+                <w:b/>
+                <w:color w:val="FFFFFF"/>
+                <w:sz w:val="14"/>
+                <w:szCs w:val="14"/>
+              </w:rPr>
+              <w:t xml:space="preserve">SF</w:t>
+            </w:r>
+          </w:p>
+        </w:tc>
+        <w:tc>
+          <w:tcPr>
+            <w:tcW w:w="650" w:type="dxa"/>
+            <w:shd w:val="clear" w:color="auto" w:fill="808080"/>
+            <w:vAlign w:val="center"/>
+          </w:tcPr>
+          <w:p>
+            <w:pPr>
+              <w:spacing w:before="0" w:after="0" w:line="240" w:lineRule="auto"/>
+              <w:jc w:val="center"/>
+            </w:pPr>
+            <w:r>
+              <w:rPr>
+                <w:rFonts w:ascii="Arial" w:hAnsi="Arial" w:cs="Arial"/>
+                <w:b/>
+                <w:color w:val="FFFFFF"/>
+                <w:sz w:val="14"/>
+                <w:szCs w:val="14"/>
+              </w:rPr>
+              <w:t xml:space="preserve">Built</w:t>
+            </w:r>
+          </w:p>
+        </w:tc>
+        <w:tc>
+          <w:tcPr>
+            <w:tcW w:w="700" w:type="dxa"/>
+            <w:shd w:val="clear" w:color="auto" w:fill="808080"/>
+            <w:vAlign w:val="center"/>
+          </w:tcPr>
+          <w:p>
+            <w:pPr>
+              <w:spacing w:before="0" w:after="0" w:line="240" w:lineRule="auto"/>
+              <w:jc w:val="center"/>
+            </w:pPr>
+            <w:r>
+              <w:rPr>
+                <w:rFonts w:ascii="Arial" w:hAnsi="Arial" w:cs="Arial"/>
+                <w:b/>
+                <w:color w:val="FFFFFF"/>
+                <w:sz w:val="14"/>
+                <w:szCs w:val="14"/>
+              </w:rPr>
+              <w:t xml:space="preserve">Type</w:t>
+            </w:r>
+          </w:p>
+        </w:tc>
+        <w:tc>
+          <w:tcPr>
+            <w:tcW w:w="950" w:type="dxa"/>
+            <w:shd w:val="clear" w:color="auto" w:fill="808080"/>
+            <w:vAlign w:val="center"/>
+          </w:tcPr>
+          <w:p>
+            <w:pPr>
+              <w:spacing w:before="0" w:after="0" w:line="240" w:lineRule="auto"/>
+              <w:jc w:val="center"/>
+            </w:pPr>
+            <w:r>
+              <w:rPr>
+                <w:rFonts w:ascii="Arial" w:hAnsi="Arial" w:cs="Arial"/>
+                <w:b/>
+                <w:color w:val="FFFFFF"/>
+                <w:sz w:val="14"/>
+                <w:szCs w:val="14"/>
+              </w:rPr>
+              <w:t xml:space="preserve">Asking $/SF</w:t>
+            </w:r>
+          </w:p>
+        </w:tc>
+        <w:tc>
+          <w:tcPr>
+            <w:tcW w:w="1010" w:type="dxa"/>
+            <w:shd w:val="clear" w:color="auto" w:fill="808080"/>
+            <w:vAlign w:val="center"/>
+          </w:tcPr>
+          <w:p>
+            <w:pPr>
+              <w:spacing w:before="0" w:after="0" w:line="240" w:lineRule="auto"/>
+              <w:jc w:val="center"/>
+            </w:pPr>
+            <w:r>
+              <w:rPr>
+                <w:rFonts w:ascii="Arial" w:hAnsi="Arial" w:cs="Arial"/>
+                <w:b/>
+                <w:color w:val="FFFFFF"/>
+                <w:sz w:val="14"/>
+                <w:szCs w:val="14"/>
+              </w:rPr>
+              <w:t xml:space="preserve">Adj. NNN $/SF</w:t>
+            </w:r>
+          </w:p>
+        </w:tc>
+      </w:tr>
+      <w:tr>
+        <w:trPr>
+          <w:cantSplit/>
+        </w:trPr>
+        <w:tc>
+          <w:tcPr>
+            <w:tcW w:w="350" w:type="dxa"/>
+            <w:vAlign w:val="center"/>
+          </w:tcPr>
+          <w:p>
+            <w:pPr>
+              <w:spacing w:before="0" w:after="0" w:line="240" w:lineRule="auto"/>
+              <w:jc w:val="center"/>
+            </w:pPr>
+            <w:r>
+              <w:rPr>
+                <w:rFonts w:ascii="Arial" w:hAnsi="Arial" w:cs="Arial"/>
+                <w:sz w:val="14"/>
+                <w:szCs w:val="14"/>
+              </w:rPr>
+              <w:t xml:space="preserve">1</w:t>
+            </w:r>
+          </w:p>
+        </w:tc>
+        <w:tc>
+          <w:tcPr>
+            <w:tcW w:w="2150" w:type="dxa"/>
+            <w:vAlign w:val="center"/>
+          </w:tcPr>
+          <w:p>
+            <w:pPr>
+              <w:spacing w:before="0" w:after="0" w:line="240" w:lineRule="auto"/>
+              <w:jc w:val="left"/>
+            </w:pPr>
+            <w:r>
+              <w:rPr>
+                <w:rFonts w:ascii="Arial" w:hAnsi="Arial" w:cs="Arial"/>
+                <w:sz w:val="14"/>
+                <w:szCs w:val="14"/>
+              </w:rPr>
+              <w:t xml:space="preserve">5200-5280 Broadway, Ste 5280</w:t>
+            </w:r>
+          </w:p>
+        </w:tc>
+        <w:tc>
+          <w:tcPr>
+            <w:tcW w:w="1000" w:type="dxa"/>
+            <w:vAlign w:val="center"/>
+          </w:tcPr>
+          <w:p>
+            <w:pPr>
+              <w:spacing w:before="0" w:after="0" w:line="240" w:lineRule="auto"/>
+              <w:jc w:val="left"/>
+            </w:pPr>
+            <w:r>
+              <w:rPr>
+                <w:rFonts w:ascii="Arial" w:hAnsi="Arial" w:cs="Arial"/>
+                <w:sz w:val="14"/>
+                <w:szCs w:val="14"/>
+              </w:rPr>
+              <w:t xml:space="preserve">Denver</w:t>
+            </w:r>
+          </w:p>
+        </w:tc>
+        <w:tc>
+          <w:tcPr>
+            <w:tcW w:w="900" w:type="dxa"/>
+            <w:vAlign w:val="center"/>
+          </w:tcPr>
+          <w:p>
+            <w:pPr>
+              <w:spacing w:before="0" w:after="0" w:line="240" w:lineRule="auto"/>
+              <w:jc w:val="center"/>
+            </w:pPr>
+            <w:r>
+              <w:rPr>
+                <w:rFonts w:ascii="Arial" w:hAnsi="Arial" w:cs="Arial"/>
+                <w:sz w:val="14"/>
+                <w:szCs w:val="14"/>
+              </w:rPr>
+              <w:t xml:space="preserve">6/24/2024</w:t>
+            </w:r>
+          </w:p>
+        </w:tc>
+        <w:tc>
+          <w:tcPr>
+            <w:tcW w:w="850" w:type="dxa"/>
+            <w:vAlign w:val="center"/>
+          </w:tcPr>
+          <w:p>
+            <w:pPr>
+              <w:spacing w:before="0" w:after="0" w:line="240" w:lineRule="auto"/>
+              <w:jc w:val="left"/>
+            </w:pPr>
+            <w:r>
+              <w:rPr>
+                <w:rFonts w:ascii="Arial" w:hAnsi="Arial" w:cs="Arial"/>
+                <w:sz w:val="14"/>
+                <w:szCs w:val="14"/>
+              </w:rPr>
+              <w:t xml:space="preserve">Flex</w:t>
+            </w:r>
+          </w:p>
+        </w:tc>
+        <w:tc>
+          <w:tcPr>
+            <w:tcW w:w="700" w:type="dxa"/>
+            <w:vAlign w:val="center"/>
+          </w:tcPr>
+          <w:p>
+            <w:pPr>
+              <w:spacing w:before="0" w:after="0" w:line="240" w:lineRule="auto"/>
+              <w:jc w:val="right"/>
+            </w:pPr>
+            <w:r>
+              <w:rPr>
+                <w:rFonts w:ascii="Arial" w:hAnsi="Arial" w:cs="Arial"/>
+                <w:sz w:val="14"/>
+                <w:szCs w:val="14"/>
+              </w:rPr>
+              <w:t xml:space="preserve">3,985</w:t>
+            </w:r>
+          </w:p>
+        </w:tc>
+        <w:tc>
+          <w:tcPr>
+            <w:tcW w:w="650" w:type="dxa"/>
+            <w:vAlign w:val="center"/>
+          </w:tcPr>
+          <w:p>
+            <w:pPr>
+              <w:spacing w:before="0" w:after="0" w:line="240" w:lineRule="auto"/>
+              <w:jc w:val="center"/>
+            </w:pPr>
+            <w:r>
+              <w:rPr>
+                <w:rFonts w:ascii="Arial" w:hAnsi="Arial" w:cs="Arial"/>
+                <w:sz w:val="14"/>
+                <w:szCs w:val="14"/>
+              </w:rPr>
+              <w:t xml:space="preserve">1977</w:t>
+            </w:r>
+          </w:p>
+        </w:tc>
+        <w:tc>
+          <w:tcPr>
+            <w:tcW w:w="700" w:type="dxa"/>
+            <w:vAlign w:val="center"/>
+          </w:tcPr>
+          <w:p>
+            <w:pPr>
+              <w:spacing w:before="0" w:after="0" w:line="240" w:lineRule="auto"/>
+              <w:jc w:val="center"/>
+            </w:pPr>
+            <w:r>
+              <w:rPr>
+                <w:rFonts w:ascii="Arial" w:hAnsi="Arial" w:cs="Arial"/>
+                <w:sz w:val="14"/>
+                <w:szCs w:val="14"/>
+              </w:rPr>
+              <w:t xml:space="preserve">NNN</w:t>
+            </w:r>
+          </w:p>
+        </w:tc>
+        <w:tc>
+          <w:tcPr>
+            <w:tcW w:w="950" w:type="dxa"/>
+            <w:vAlign w:val="center"/>
+          </w:tcPr>
+          <w:p>
+            <w:pPr>
+              <w:spacing w:before="0" w:after="0" w:line="240" w:lineRule="auto"/>
+              <w:jc w:val="right"/>
+            </w:pPr>
+            <w:r>
+              <w:rPr>
+                <w:rFonts w:ascii="Arial" w:hAnsi="Arial" w:cs="Arial"/>
+                <w:sz w:val="14"/>
+                <w:szCs w:val="14"/>
+              </w:rPr>
+              <w:t xml:space="preserve">$20.00</w:t>
+            </w:r>
+          </w:p>
+        </w:tc>
+        <w:tc>
+          <w:tcPr>
+            <w:tcW w:w="1010" w:type="dxa"/>
+            <w:vAlign w:val="center"/>
+          </w:tcPr>
+          <w:p>
+            <w:pPr>
+              <w:spacing w:before="0" w:after="0" w:line="240" w:lineRule="auto"/>
+              <w:jc w:val="right"/>
+            </w:pPr>
+            <w:r>
+              <w:rPr>
+                <w:rFonts w:ascii="Arial" w:hAnsi="Arial" w:cs="Arial"/>
+                <w:sz w:val="14"/>
+                <w:szCs w:val="14"/>
+              </w:rPr>
+              <w:t xml:space="preserve">$20.00</w:t>
+            </w:r>
+          </w:p>
+        </w:tc>
+      </w:tr>
+      <w:tr>
+        <w:trPr>
+          <w:cantSplit/>
+        </w:trPr>
+        <w:tc>
+          <w:tcPr>
+            <w:tcW w:w="350" w:type="dxa"/>
+            <w:vAlign w:val="center"/>
+          </w:tcPr>
+          <w:p>
+            <w:pPr>
+              <w:spacing w:before="0" w:after="0" w:line="240" w:lineRule="auto"/>
+              <w:jc w:val="center"/>
+            </w:pPr>
+            <w:r>
+              <w:rPr>
+                <w:rFonts w:ascii="Arial" w:hAnsi="Arial" w:cs="Arial"/>
+                <w:sz w:val="14"/>
+                <w:szCs w:val="14"/>
+              </w:rPr>
+              <w:t xml:space="preserve">2</w:t>
+            </w:r>
+          </w:p>
+        </w:tc>
+        <w:tc>
+          <w:tcPr>
+            <w:tcW w:w="2150" w:type="dxa"/>
+            <w:vAlign w:val="center"/>
+          </w:tcPr>
+          <w:p>
+            <w:pPr>
+              <w:spacing w:before="0" w:after="0" w:line="240" w:lineRule="auto"/>
+              <w:jc w:val="left"/>
+            </w:pPr>
+            <w:r>
+              <w:rPr>
+                <w:rFonts w:ascii="Arial" w:hAnsi="Arial" w:cs="Arial"/>
+                <w:sz w:val="14"/>
+                <w:szCs w:val="14"/>
+              </w:rPr>
+              <w:t xml:space="preserve">913 E 75th Ave, Bldg A</w:t>
+            </w:r>
+          </w:p>
+        </w:tc>
+        <w:tc>
+          <w:tcPr>
+            <w:tcW w:w="1000" w:type="dxa"/>
+            <w:vAlign w:val="center"/>
+          </w:tcPr>
+          <w:p>
+            <w:pPr>
+              <w:spacing w:before="0" w:after="0" w:line="240" w:lineRule="auto"/>
+              <w:jc w:val="left"/>
+            </w:pPr>
+            <w:r>
+              <w:rPr>
+                <w:rFonts w:ascii="Arial" w:hAnsi="Arial" w:cs="Arial"/>
+                <w:sz w:val="14"/>
+                <w:szCs w:val="14"/>
+              </w:rPr>
+              <w:t xml:space="preserve">Denver</w:t>
+            </w:r>
+          </w:p>
+        </w:tc>
+        <w:tc>
+          <w:tcPr>
+            <w:tcW w:w="900" w:type="dxa"/>
+            <w:vAlign w:val="center"/>
+          </w:tcPr>
+          <w:p>
+            <w:pPr>
+              <w:spacing w:before="0" w:after="0" w:line="240" w:lineRule="auto"/>
+              <w:jc w:val="center"/>
+            </w:pPr>
+            <w:r>
+              <w:rPr>
+                <w:rFonts w:ascii="Arial" w:hAnsi="Arial" w:cs="Arial"/>
+                <w:sz w:val="14"/>
+                <w:szCs w:val="14"/>
+              </w:rPr>
+              <w:t xml:space="preserve">1/29/2024</w:t>
+            </w:r>
+          </w:p>
+        </w:tc>
+        <w:tc>
+          <w:tcPr>
+            <w:tcW w:w="850" w:type="dxa"/>
+            <w:vAlign w:val="center"/>
+          </w:tcPr>
+          <w:p>
+            <w:pPr>
+              <w:spacing w:before="0" w:after="0" w:line="240" w:lineRule="auto"/>
+              <w:jc w:val="left"/>
+            </w:pPr>
+            <w:r>
+              <w:rPr>
+                <w:rFonts w:ascii="Arial" w:hAnsi="Arial" w:cs="Arial"/>
+                <w:sz w:val="14"/>
+                <w:szCs w:val="14"/>
+              </w:rPr>
+              <w:t xml:space="preserve">Industrial</w:t>
+            </w:r>
+          </w:p>
+        </w:tc>
+        <w:tc>
+          <w:tcPr>
+            <w:tcW w:w="700" w:type="dxa"/>
+            <w:vAlign w:val="center"/>
+          </w:tcPr>
+          <w:p>
+            <w:pPr>
+              <w:spacing w:before="0" w:after="0" w:line="240" w:lineRule="auto"/>
+              <w:jc w:val="right"/>
+            </w:pPr>
+            <w:r>
+              <w:rPr>
+                <w:rFonts w:ascii="Arial" w:hAnsi="Arial" w:cs="Arial"/>
+                <w:sz w:val="14"/>
+                <w:szCs w:val="14"/>
+              </w:rPr>
+              <w:t xml:space="preserve">3,056</w:t>
+            </w:r>
+          </w:p>
+        </w:tc>
+        <w:tc>
+          <w:tcPr>
+            <w:tcW w:w="650" w:type="dxa"/>
+            <w:vAlign w:val="center"/>
+          </w:tcPr>
+          <w:p>
+            <w:pPr>
+              <w:spacing w:before="0" w:after="0" w:line="240" w:lineRule="auto"/>
+              <w:jc w:val="center"/>
+            </w:pPr>
+            <w:r>
+              <w:rPr>
+                <w:rFonts w:ascii="Arial" w:hAnsi="Arial" w:cs="Arial"/>
+                <w:sz w:val="14"/>
+                <w:szCs w:val="14"/>
+              </w:rPr>
+              <w:t xml:space="preserve">2000</w:t>
+            </w:r>
+          </w:p>
+        </w:tc>
+        <w:tc>
+          <w:tcPr>
+            <w:tcW w:w="700" w:type="dxa"/>
+            <w:vAlign w:val="center"/>
+          </w:tcPr>
+          <w:p>
+            <w:pPr>
+              <w:spacing w:before="0" w:after="0" w:line="240" w:lineRule="auto"/>
+              <w:jc w:val="center"/>
+            </w:pPr>
+            <w:r>
+              <w:rPr>
+                <w:rFonts w:ascii="Arial" w:hAnsi="Arial" w:cs="Arial"/>
+                <w:sz w:val="14"/>
+                <w:szCs w:val="14"/>
+              </w:rPr>
+              <w:t xml:space="preserve">NNN</w:t>
+            </w:r>
+          </w:p>
+        </w:tc>
+        <w:tc>
+          <w:tcPr>
+            <w:tcW w:w="950" w:type="dxa"/>
+            <w:vAlign w:val="center"/>
+          </w:tcPr>
+          <w:p>
+            <w:pPr>
+              <w:spacing w:before="0" w:after="0" w:line="240" w:lineRule="auto"/>
+              <w:jc w:val="right"/>
+            </w:pPr>
+            <w:r>
+              <w:rPr>
+                <w:rFonts w:ascii="Arial" w:hAnsi="Arial" w:cs="Arial"/>
+                <w:sz w:val="14"/>
+                <w:szCs w:val="14"/>
+              </w:rPr>
+              <w:t xml:space="preserve">$14.00</w:t>
+            </w:r>
+          </w:p>
+        </w:tc>
+        <w:tc>
+          <w:tcPr>
+            <w:tcW w:w="1010" w:type="dxa"/>
+            <w:vAlign w:val="center"/>
+          </w:tcPr>
+          <w:p>
+            <w:pPr>
+              <w:spacing w:before="0" w:after="0" w:line="240" w:lineRule="auto"/>
+              <w:jc w:val="right"/>
+            </w:pPr>
+            <w:r>
+              <w:rPr>
+                <w:rFonts w:ascii="Arial" w:hAnsi="Arial" w:cs="Arial"/>
+                <w:sz w:val="14"/>
+                <w:szCs w:val="14"/>
+              </w:rPr>
+              <w:t xml:space="preserve">$14.00</w:t>
+            </w:r>
+          </w:p>
+        </w:tc>
+      </w:tr>
+      <w:tr>
+        <w:trPr>
+          <w:cantSplit/>
+        </w:trPr>
+        <w:tc>
+          <w:tcPr>
+            <w:tcW w:w="350" w:type="dxa"/>
+            <w:vAlign w:val="center"/>
+          </w:tcPr>
+          <w:p>
+            <w:pPr>
+              <w:spacing w:before="0" w:after="0" w:line="240" w:lineRule="auto"/>
+              <w:jc w:val="center"/>
+            </w:pPr>
+            <w:r>
+              <w:rPr>
+                <w:rFonts w:ascii="Arial" w:hAnsi="Arial" w:cs="Arial"/>
+                <w:sz w:val="14"/>
+                <w:szCs w:val="14"/>
+              </w:rPr>
+              <w:t xml:space="preserve">3</w:t>
+            </w:r>
+          </w:p>
+        </w:tc>
+        <w:tc>
+          <w:tcPr>
+            <w:tcW w:w="2150" w:type="dxa"/>
+            <w:vAlign w:val="center"/>
+          </w:tcPr>
+          <w:p>
+            <w:pPr>
+              <w:spacing w:before="0" w:after="0" w:line="240" w:lineRule="auto"/>
+              <w:jc w:val="left"/>
+            </w:pPr>
+            <w:r>
+              <w:rPr>
+                <w:rFonts w:ascii="Arial" w:hAnsi="Arial" w:cs="Arial"/>
+                <w:sz w:val="14"/>
+                <w:szCs w:val="14"/>
+              </w:rPr>
+              <w:t xml:space="preserve">913 E 75th Ave, Bldg B</w:t>
+            </w:r>
+          </w:p>
+        </w:tc>
+        <w:tc>
+          <w:tcPr>
+            <w:tcW w:w="1000" w:type="dxa"/>
+            <w:vAlign w:val="center"/>
+          </w:tcPr>
+          <w:p>
+            <w:pPr>
+              <w:spacing w:before="0" w:after="0" w:line="240" w:lineRule="auto"/>
+              <w:jc w:val="left"/>
+            </w:pPr>
+            <w:r>
+              <w:rPr>
+                <w:rFonts w:ascii="Arial" w:hAnsi="Arial" w:cs="Arial"/>
+                <w:sz w:val="14"/>
+                <w:szCs w:val="14"/>
+              </w:rPr>
+              <w:t xml:space="preserve">Denver</w:t>
+            </w:r>
+          </w:p>
+        </w:tc>
+        <w:tc>
+          <w:tcPr>
+            <w:tcW w:w="900" w:type="dxa"/>
+            <w:vAlign w:val="center"/>
+          </w:tcPr>
+          <w:p>
+            <w:pPr>
+              <w:spacing w:before="0" w:after="0" w:line="240" w:lineRule="auto"/>
+              <w:jc w:val="center"/>
+            </w:pPr>
+            <w:r>
+              <w:rPr>
+                <w:rFonts w:ascii="Arial" w:hAnsi="Arial" w:cs="Arial"/>
+                <w:sz w:val="14"/>
+                <w:szCs w:val="14"/>
+              </w:rPr>
+              <w:t xml:space="preserve">2/19/2024</w:t>
+            </w:r>
+          </w:p>
+        </w:tc>
+        <w:tc>
+          <w:tcPr>
+            <w:tcW w:w="850" w:type="dxa"/>
+            <w:vAlign w:val="center"/>
+          </w:tcPr>
+          <w:p>
+            <w:pPr>
+              <w:spacing w:before="0" w:after="0" w:line="240" w:lineRule="auto"/>
+              <w:jc w:val="left"/>
+            </w:pPr>
+            <w:r>
+              <w:rPr>
+                <w:rFonts w:ascii="Arial" w:hAnsi="Arial" w:cs="Arial"/>
+                <w:sz w:val="14"/>
+                <w:szCs w:val="14"/>
+              </w:rPr>
+              <w:t xml:space="preserve">Industrial</w:t>
+            </w:r>
+          </w:p>
+        </w:tc>
+        <w:tc>
+          <w:tcPr>
+            <w:tcW w:w="700" w:type="dxa"/>
+            <w:vAlign w:val="center"/>
+          </w:tcPr>
+          <w:p>
+            <w:pPr>
+              <w:spacing w:before="0" w:after="0" w:line="240" w:lineRule="auto"/>
+              <w:jc w:val="right"/>
+            </w:pPr>
+            <w:r>
+              <w:rPr>
+                <w:rFonts w:ascii="Arial" w:hAnsi="Arial" w:cs="Arial"/>
+                <w:sz w:val="14"/>
+                <w:szCs w:val="14"/>
+              </w:rPr>
+              <w:t xml:space="preserve">2,311</w:t>
+            </w:r>
+          </w:p>
+        </w:tc>
+        <w:tc>
+          <w:tcPr>
+            <w:tcW w:w="650" w:type="dxa"/>
+            <w:vAlign w:val="center"/>
+          </w:tcPr>
+          <w:p>
+            <w:pPr>
+              <w:spacing w:before="0" w:after="0" w:line="240" w:lineRule="auto"/>
+              <w:jc w:val="center"/>
+            </w:pPr>
+            <w:r>
+              <w:rPr>
+                <w:rFonts w:ascii="Arial" w:hAnsi="Arial" w:cs="Arial"/>
+                <w:sz w:val="14"/>
+                <w:szCs w:val="14"/>
+              </w:rPr>
+              <w:t xml:space="preserve">1998</w:t>
+            </w:r>
+          </w:p>
+        </w:tc>
+        <w:tc>
+          <w:tcPr>
+            <w:tcW w:w="700" w:type="dxa"/>
+            <w:vAlign w:val="center"/>
+          </w:tcPr>
+          <w:p>
+            <w:pPr>
+              <w:spacing w:before="0" w:after="0" w:line="240" w:lineRule="auto"/>
+              <w:jc w:val="center"/>
+            </w:pPr>
+            <w:r>
+              <w:rPr>
+                <w:rFonts w:ascii="Arial" w:hAnsi="Arial" w:cs="Arial"/>
+                <w:sz w:val="14"/>
+                <w:szCs w:val="14"/>
+              </w:rPr>
+              <w:t xml:space="preserve">NNN</w:t>
+            </w:r>
+          </w:p>
+        </w:tc>
+        <w:tc>
+          <w:tcPr>
+            <w:tcW w:w="950" w:type="dxa"/>
+            <w:vAlign w:val="center"/>
+          </w:tcPr>
+          <w:p>
+            <w:pPr>
+              <w:spacing w:before="0" w:after="0" w:line="240" w:lineRule="auto"/>
+              <w:jc w:val="right"/>
+            </w:pPr>
+            <w:r>
+              <w:rPr>
+                <w:rFonts w:ascii="Arial" w:hAnsi="Arial" w:cs="Arial"/>
+                <w:sz w:val="14"/>
+                <w:szCs w:val="14"/>
+              </w:rPr>
+              <w:t xml:space="preserve">$14.00</w:t>
+            </w:r>
+          </w:p>
+        </w:tc>
+        <w:tc>
+          <w:tcPr>
+            <w:tcW w:w="1010" w:type="dxa"/>
+            <w:vAlign w:val="center"/>
+          </w:tcPr>
+          <w:p>
+            <w:pPr>
+              <w:spacing w:before="0" w:after="0" w:line="240" w:lineRule="auto"/>
+              <w:jc w:val="right"/>
+            </w:pPr>
+            <w:r>
+              <w:rPr>
+                <w:rFonts w:ascii="Arial" w:hAnsi="Arial" w:cs="Arial"/>
+                <w:sz w:val="14"/>
+                <w:szCs w:val="14"/>
+              </w:rPr>
+              <w:t xml:space="preserve">$14.00</w:t>
+            </w:r>
+          </w:p>
+        </w:tc>
+      </w:tr>
+      <w:tr>
+        <w:trPr>
+          <w:cantSplit/>
+        </w:trPr>
+        <w:tc>
+          <w:tcPr>
+            <w:tcW w:w="350" w:type="dxa"/>
+            <w:vAlign w:val="center"/>
+          </w:tcPr>
+          <w:p>
+            <w:pPr>
+              <w:spacing w:before="0" w:after="0" w:line="240" w:lineRule="auto"/>
+              <w:jc w:val="center"/>
+            </w:pPr>
+            <w:r>
+              <w:rPr>
+                <w:rFonts w:ascii="Arial" w:hAnsi="Arial" w:cs="Arial"/>
+                <w:sz w:val="14"/>
+                <w:szCs w:val="14"/>
+              </w:rPr>
+              <w:t xml:space="preserve">4</w:t>
+            </w:r>
+          </w:p>
+        </w:tc>
+        <w:tc>
+          <w:tcPr>
+            <w:tcW w:w="2150" w:type="dxa"/>
+            <w:vAlign w:val="center"/>
+          </w:tcPr>
+          <w:p>
+            <w:pPr>
+              <w:spacing w:before="0" w:after="0" w:line="240" w:lineRule="auto"/>
+              <w:jc w:val="left"/>
+            </w:pPr>
+            <w:r>
+              <w:rPr>
+                <w:rFonts w:ascii="Arial" w:hAnsi="Arial" w:cs="Arial"/>
+                <w:sz w:val="14"/>
+                <w:szCs w:val="14"/>
+              </w:rPr>
+              <w:t xml:space="preserve">6535 York St, Ste 109</w:t>
+            </w:r>
+          </w:p>
+        </w:tc>
+        <w:tc>
+          <w:tcPr>
+            <w:tcW w:w="1000" w:type="dxa"/>
+            <w:vAlign w:val="center"/>
+          </w:tcPr>
+          <w:p>
+            <w:pPr>
+              <w:spacing w:before="0" w:after="0" w:line="240" w:lineRule="auto"/>
+              <w:jc w:val="left"/>
+            </w:pPr>
+            <w:r>
+              <w:rPr>
+                <w:rFonts w:ascii="Arial" w:hAnsi="Arial" w:cs="Arial"/>
+                <w:sz w:val="14"/>
+                <w:szCs w:val="14"/>
+              </w:rPr>
+              <w:t xml:space="preserve">Denver</w:t>
+            </w:r>
+          </w:p>
+        </w:tc>
+        <w:tc>
+          <w:tcPr>
+            <w:tcW w:w="900" w:type="dxa"/>
+            <w:vAlign w:val="center"/>
+          </w:tcPr>
+          <w:p>
+            <w:pPr>
+              <w:spacing w:before="0" w:after="0" w:line="240" w:lineRule="auto"/>
+              <w:jc w:val="center"/>
+            </w:pPr>
+            <w:r>
+              <w:rPr>
+                <w:rFonts w:ascii="Arial" w:hAnsi="Arial" w:cs="Arial"/>
+                <w:sz w:val="14"/>
+                <w:szCs w:val="14"/>
+              </w:rPr>
+              <w:t xml:space="preserve">8/29/2022</w:t>
+            </w:r>
+          </w:p>
+        </w:tc>
+        <w:tc>
+          <w:tcPr>
+            <w:tcW w:w="850" w:type="dxa"/>
+            <w:vAlign w:val="center"/>
+          </w:tcPr>
+          <w:p>
+            <w:pPr>
+              <w:spacing w:before="0" w:after="0" w:line="240" w:lineRule="auto"/>
+              <w:jc w:val="left"/>
+            </w:pPr>
+            <w:r>
+              <w:rPr>
+                <w:rFonts w:ascii="Arial" w:hAnsi="Arial" w:cs="Arial"/>
+                <w:sz w:val="14"/>
+                <w:szCs w:val="14"/>
+              </w:rPr>
+              <w:t xml:space="preserve">Industrial</w:t>
+            </w:r>
+          </w:p>
+        </w:tc>
+        <w:tc>
+          <w:tcPr>
+            <w:tcW w:w="700" w:type="dxa"/>
+            <w:vAlign w:val="center"/>
+          </w:tcPr>
+          <w:p>
+            <w:pPr>
+              <w:spacing w:before="0" w:after="0" w:line="240" w:lineRule="auto"/>
+              <w:jc w:val="right"/>
+            </w:pPr>
+            <w:r>
+              <w:rPr>
+                <w:rFonts w:ascii="Arial" w:hAnsi="Arial" w:cs="Arial"/>
+                <w:sz w:val="14"/>
+                <w:szCs w:val="14"/>
+              </w:rPr>
+              <w:t xml:space="preserve">3,750</w:t>
+            </w:r>
+          </w:p>
+        </w:tc>
+        <w:tc>
+          <w:tcPr>
+            <w:tcW w:w="650" w:type="dxa"/>
+            <w:vAlign w:val="center"/>
+          </w:tcPr>
+          <w:p>
+            <w:pPr>
+              <w:spacing w:before="0" w:after="0" w:line="240" w:lineRule="auto"/>
+              <w:jc w:val="center"/>
+            </w:pPr>
+            <w:r>
+              <w:rPr>
+                <w:rFonts w:ascii="Arial" w:hAnsi="Arial" w:cs="Arial"/>
+                <w:sz w:val="14"/>
+                <w:szCs w:val="14"/>
+              </w:rPr>
+              <w:t xml:space="preserve">1999</w:t>
+            </w:r>
+          </w:p>
+        </w:tc>
+        <w:tc>
+          <w:tcPr>
+            <w:tcW w:w="700" w:type="dxa"/>
+            <w:vAlign w:val="center"/>
+          </w:tcPr>
+          <w:p>
+            <w:pPr>
+              <w:spacing w:before="0" w:after="0" w:line="240" w:lineRule="auto"/>
+              <w:jc w:val="center"/>
+            </w:pPr>
+            <w:r>
+              <w:rPr>
+                <w:rFonts w:ascii="Arial" w:hAnsi="Arial" w:cs="Arial"/>
+                <w:sz w:val="14"/>
+                <w:szCs w:val="14"/>
+              </w:rPr>
+              <w:t xml:space="preserve">MG</w:t>
+            </w:r>
+          </w:p>
+        </w:tc>
+        <w:tc>
+          <w:tcPr>
+            <w:tcW w:w="950" w:type="dxa"/>
+            <w:vAlign w:val="center"/>
+          </w:tcPr>
+          <w:p>
+            <w:pPr>
+              <w:spacing w:before="0" w:after="0" w:line="240" w:lineRule="auto"/>
+              <w:jc w:val="right"/>
+            </w:pPr>
+            <w:r>
+              <w:rPr>
+                <w:rFonts w:ascii="Arial" w:hAnsi="Arial" w:cs="Arial"/>
+                <w:sz w:val="14"/>
+                <w:szCs w:val="14"/>
+              </w:rPr>
+              <w:t xml:space="preserve">$13.00</w:t>
+            </w:r>
+          </w:p>
+        </w:tc>
+        <w:tc>
+          <w:tcPr>
+            <w:tcW w:w="1010" w:type="dxa"/>
+            <w:vAlign w:val="center"/>
+          </w:tcPr>
+          <w:p>
+            <w:pPr>
+              <w:spacing w:before="0" w:after="0" w:line="240" w:lineRule="auto"/>
+              <w:jc w:val="right"/>
+            </w:pPr>
+            <w:r>
+              <w:rPr>
+                <w:rFonts w:ascii="Arial" w:hAnsi="Arial" w:cs="Arial"/>
+                <w:sz w:val="14"/>
+                <w:szCs w:val="14"/>
+              </w:rPr>
+              <w:t xml:space="preserve">$9.00</w:t>
+            </w:r>
+          </w:p>
+        </w:tc>
+      </w:tr>
+      <w:tr>
+        <w:trPr>
+          <w:cantSplit/>
+        </w:trPr>
+        <w:tc>
+          <w:tcPr>
+            <w:tcW w:w="350" w:type="dxa"/>
+            <w:vAlign w:val="center"/>
+          </w:tcPr>
+          <w:p>
+            <w:pPr>
+              <w:spacing w:before="0" w:after="0" w:line="240" w:lineRule="auto"/>
+              <w:jc w:val="center"/>
+            </w:pPr>
+            <w:r>
+              <w:rPr>
+                <w:rFonts w:ascii="Arial" w:hAnsi="Arial" w:cs="Arial"/>
+                <w:sz w:val="14"/>
+                <w:szCs w:val="14"/>
+              </w:rPr>
+              <w:t xml:space="preserve">5</w:t>
+            </w:r>
+          </w:p>
+        </w:tc>
+        <w:tc>
+          <w:tcPr>
+            <w:tcW w:w="2150" w:type="dxa"/>
+            <w:vAlign w:val="center"/>
+          </w:tcPr>
+          <w:p>
+            <w:pPr>
+              <w:spacing w:before="0" w:after="0" w:line="240" w:lineRule="auto"/>
+              <w:jc w:val="left"/>
+            </w:pPr>
+            <w:r>
+              <w:rPr>
+                <w:rFonts w:ascii="Arial" w:hAnsi="Arial" w:cs="Arial"/>
+                <w:sz w:val="14"/>
+                <w:szCs w:val="14"/>
+              </w:rPr>
+              <w:t xml:space="preserve">800 E 73rd Ave, Ste 4</w:t>
+            </w:r>
+          </w:p>
+        </w:tc>
+        <w:tc>
+          <w:tcPr>
+            <w:tcW w:w="1000" w:type="dxa"/>
+            <w:vAlign w:val="center"/>
+          </w:tcPr>
+          <w:p>
+            <w:pPr>
+              <w:spacing w:before="0" w:after="0" w:line="240" w:lineRule="auto"/>
+              <w:jc w:val="left"/>
+            </w:pPr>
+            <w:r>
+              <w:rPr>
+                <w:rFonts w:ascii="Arial" w:hAnsi="Arial" w:cs="Arial"/>
+                <w:sz w:val="14"/>
+                <w:szCs w:val="14"/>
+              </w:rPr>
+              <w:t xml:space="preserve">Denver</w:t>
+            </w:r>
+          </w:p>
+        </w:tc>
+        <w:tc>
+          <w:tcPr>
+            <w:tcW w:w="900" w:type="dxa"/>
+            <w:vAlign w:val="center"/>
+          </w:tcPr>
+          <w:p>
+            <w:pPr>
+              <w:spacing w:before="0" w:after="0" w:line="240" w:lineRule="auto"/>
+              <w:jc w:val="center"/>
+            </w:pPr>
+            <w:r>
+              <w:rPr>
+                <w:rFonts w:ascii="Arial" w:hAnsi="Arial" w:cs="Arial"/>
+                <w:sz w:val="14"/>
+                <w:szCs w:val="14"/>
+              </w:rPr>
+              <w:t xml:space="preserve">5/17/2022</w:t>
+            </w:r>
+          </w:p>
+        </w:tc>
+        <w:tc>
+          <w:tcPr>
+            <w:tcW w:w="850" w:type="dxa"/>
+            <w:vAlign w:val="center"/>
+          </w:tcPr>
+          <w:p>
+            <w:pPr>
+              <w:spacing w:before="0" w:after="0" w:line="240" w:lineRule="auto"/>
+              <w:jc w:val="left"/>
+            </w:pPr>
+            <w:r>
+              <w:rPr>
+                <w:rFonts w:ascii="Arial" w:hAnsi="Arial" w:cs="Arial"/>
+                <w:sz w:val="14"/>
+                <w:szCs w:val="14"/>
+              </w:rPr>
+              <w:t xml:space="preserve">Office</w:t>
+            </w:r>
+          </w:p>
+        </w:tc>
+        <w:tc>
+          <w:tcPr>
+            <w:tcW w:w="700" w:type="dxa"/>
+            <w:vAlign w:val="center"/>
+          </w:tcPr>
+          <w:p>
+            <w:pPr>
+              <w:spacing w:before="0" w:after="0" w:line="240" w:lineRule="auto"/>
+              <w:jc w:val="right"/>
+            </w:pPr>
+            <w:r>
+              <w:rPr>
+                <w:rFonts w:ascii="Arial" w:hAnsi="Arial" w:cs="Arial"/>
+                <w:sz w:val="14"/>
+                <w:szCs w:val="14"/>
+              </w:rPr>
+              <w:t xml:space="preserve">1,190</w:t>
+            </w:r>
+          </w:p>
+        </w:tc>
+        <w:tc>
+          <w:tcPr>
+            <w:tcW w:w="650" w:type="dxa"/>
+            <w:vAlign w:val="center"/>
+          </w:tcPr>
+          <w:p>
+            <w:pPr>
+              <w:spacing w:before="0" w:after="0" w:line="240" w:lineRule="auto"/>
+              <w:jc w:val="center"/>
+            </w:pPr>
+            <w:r>
+              <w:rPr>
+                <w:rFonts w:ascii="Arial" w:hAnsi="Arial" w:cs="Arial"/>
+                <w:sz w:val="14"/>
+                <w:szCs w:val="14"/>
+              </w:rPr>
+              <w:t xml:space="preserve">1982</w:t>
+            </w:r>
+          </w:p>
+        </w:tc>
+        <w:tc>
+          <w:tcPr>
+            <w:tcW w:w="700" w:type="dxa"/>
+            <w:vAlign w:val="center"/>
+          </w:tcPr>
+          <w:p>
+            <w:pPr>
+              <w:spacing w:before="0" w:after="0" w:line="240" w:lineRule="auto"/>
+              <w:jc w:val="center"/>
+            </w:pPr>
+            <w:r>
+              <w:rPr>
+                <w:rFonts w:ascii="Arial" w:hAnsi="Arial" w:cs="Arial"/>
+                <w:sz w:val="14"/>
+                <w:szCs w:val="14"/>
+              </w:rPr>
+              <w:t xml:space="preserve">MG</w:t>
+            </w:r>
+          </w:p>
+        </w:tc>
+        <w:tc>
+          <w:tcPr>
+            <w:tcW w:w="950" w:type="dxa"/>
+            <w:vAlign w:val="center"/>
+          </w:tcPr>
+          <w:p>
+            <w:pPr>
+              <w:spacing w:before="0" w:after="0" w:line="240" w:lineRule="auto"/>
+              <w:jc w:val="right"/>
+            </w:pPr>
+            <w:r>
+              <w:rPr>
+                <w:rFonts w:ascii="Arial" w:hAnsi="Arial" w:cs="Arial"/>
+                <w:sz w:val="14"/>
+                <w:szCs w:val="14"/>
+              </w:rPr>
+              <w:t xml:space="preserve">$13.51</w:t>
+            </w:r>
+          </w:p>
+        </w:tc>
+        <w:tc>
+          <w:tcPr>
+            <w:tcW w:w="1010" w:type="dxa"/>
+            <w:vAlign w:val="center"/>
+          </w:tcPr>
+          <w:p>
+            <w:pPr>
+              <w:spacing w:before="0" w:after="0" w:line="240" w:lineRule="auto"/>
+              <w:jc w:val="right"/>
+            </w:pPr>
+            <w:r>
+              <w:rPr>
+                <w:rFonts w:ascii="Arial" w:hAnsi="Arial" w:cs="Arial"/>
+                <w:sz w:val="14"/>
+                <w:szCs w:val="14"/>
+              </w:rPr>
+              <w:t xml:space="preserve">$9.51</w:t>
+            </w:r>
+          </w:p>
+        </w:tc>
+      </w:tr>
+      <w:tr>
+        <w:trPr>
+          <w:cantSplit/>
+        </w:trPr>
+        <w:tc>
+          <w:tcPr>
+            <w:tcW w:w="8250" w:type="dxa"/>
+            <w:gridSpan w:val="9"/>
+            <w:shd w:val="clear" w:color="auto" w:fill="D9D9D9"/>
+            <w:vAlign w:val="center"/>
+          </w:tcPr>
+          <w:p>
+            <w:pPr>
+              <w:spacing w:before="0" w:after="0" w:line="240" w:lineRule="auto"/>
+              <w:jc w:val="right"/>
+            </w:pPr>
+            <w:r>
+              <w:rPr>
+                <w:rFonts w:ascii="Arial" w:hAnsi="Arial" w:cs="Arial"/>
+                <w:b/>
+                <w:sz w:val="14"/>
+                <w:szCs w:val="14"/>
+              </w:rPr>
+              <w:t xml:space="preserve">Low</w:t>
+            </w:r>
+          </w:p>
+        </w:tc>
+        <w:tc>
+          <w:tcPr>
+            <w:tcW w:w="1010" w:type="dxa"/>
+            <w:shd w:val="clear" w:color="auto" w:fill="D9D9D9"/>
+            <w:vAlign w:val="center"/>
+          </w:tcPr>
+          <w:p>
+            <w:pPr>
+              <w:spacing w:before="0" w:after="0" w:line="240" w:lineRule="auto"/>
+              <w:jc w:val="right"/>
+            </w:pPr>
+            <w:r>
+              <w:rPr>
+                <w:rFonts w:ascii="Arial" w:hAnsi="Arial" w:cs="Arial"/>
+                <w:b/>
+                <w:sz w:val="14"/>
+                <w:szCs w:val="14"/>
+              </w:rPr>
+              <w:t xml:space="preserve">$9.00</w:t>
+            </w:r>
+          </w:p>
+        </w:tc>
+      </w:tr>
+      <w:tr>
+        <w:trPr>
+          <w:cantSplit/>
+        </w:trPr>
+        <w:tc>
+          <w:tcPr>
+            <w:tcW w:w="8250" w:type="dxa"/>
+            <w:gridSpan w:val="9"/>
+            <w:shd w:val="clear" w:color="auto" w:fill="D9D9D9"/>
+            <w:vAlign w:val="center"/>
+          </w:tcPr>
+          <w:p>
+            <w:pPr>
+              <w:spacing w:before="0" w:after="0" w:line="240" w:lineRule="auto"/>
+              <w:jc w:val="right"/>
+            </w:pPr>
+            <w:r>
+              <w:rPr>
+                <w:rFonts w:ascii="Arial" w:hAnsi="Arial" w:cs="Arial"/>
+                <w:b/>
+                <w:sz w:val="14"/>
+                <w:szCs w:val="14"/>
+              </w:rPr>
+              <w:t xml:space="preserve">High</w:t>
+            </w:r>
+          </w:p>
+        </w:tc>
+        <w:tc>
+          <w:tcPr>
+            <w:tcW w:w="1010" w:type="dxa"/>
+            <w:shd w:val="clear" w:color="auto" w:fill="D9D9D9"/>
+            <w:vAlign w:val="center"/>
+          </w:tcPr>
+          <w:p>
+            <w:pPr>
+              <w:spacing w:before="0" w:after="0" w:line="240" w:lineRule="auto"/>
+              <w:jc w:val="right"/>
+            </w:pPr>
+            <w:r>
+              <w:rPr>
+                <w:rFonts w:ascii="Arial" w:hAnsi="Arial" w:cs="Arial"/>
+                <w:b/>
+                <w:sz w:val="14"/>
+                <w:szCs w:val="14"/>
+              </w:rPr>
+              <w:t xml:space="preserve">$20.00</w:t>
+            </w:r>
+          </w:p>
+        </w:tc>
+      </w:tr>
+      <w:tr>
+        <w:trPr>
+          <w:cantSplit/>
+        </w:trPr>
+        <w:tc>
+          <w:tcPr>
+            <w:tcW w:w="8250" w:type="dxa"/>
+            <w:gridSpan w:val="9"/>
+            <w:shd w:val="clear" w:color="auto" w:fill="D9D9D9"/>
+            <w:vAlign w:val="center"/>
+          </w:tcPr>
+          <w:p>
+            <w:pPr>
+              <w:spacing w:before="0" w:after="0" w:line="240" w:lineRule="auto"/>
+              <w:jc w:val="right"/>
+            </w:pPr>
+            <w:r>
+              <w:rPr>
+                <w:rFonts w:ascii="Arial" w:hAnsi="Arial" w:cs="Arial"/>
+                <w:b/>
+                <w:sz w:val="14"/>
+                <w:szCs w:val="14"/>
+              </w:rPr>
+              <w:t xml:space="preserve">Average</w:t>
+            </w:r>
+          </w:p>
+        </w:tc>
+        <w:tc>
+          <w:tcPr>
+            <w:tcW w:w="1010" w:type="dxa"/>
+            <w:shd w:val="clear" w:color="auto" w:fill="D9D9D9"/>
+            <w:vAlign w:val="center"/>
+          </w:tcPr>
+          <w:p>
+            <w:pPr>
+              <w:spacing w:before="0" w:after="0" w:line="240" w:lineRule="auto"/>
+              <w:jc w:val="right"/>
+            </w:pPr>
+            <w:r>
+              <w:rPr>
+                <w:rFonts w:ascii="Arial" w:hAnsi="Arial" w:cs="Arial"/>
+                <w:b/>
+                <w:sz w:val="14"/>
+                <w:szCs w:val="14"/>
+              </w:rPr>
+              <w:t xml:space="preserve">$13.30</w:t>
+            </w:r>
+          </w:p>
+        </w:tc>
+      </w:tr>
+      <w:tr>
+        <w:trPr>
+          <w:cantSplit/>
+        </w:trPr>
+        <w:tc>
+          <w:tcPr>
+            <w:tcW w:w="8250" w:type="dxa"/>
+            <w:gridSpan w:val="9"/>
+            <w:shd w:val="clear" w:color="auto" w:fill="D9D9D9"/>
+            <w:vAlign w:val="center"/>
+          </w:tcPr>
+          <w:p>
+            <w:pPr>
+              <w:spacing w:before="0" w:after="0" w:line="240" w:lineRule="auto"/>
+              <w:jc w:val="right"/>
+            </w:pPr>
+            <w:r>
+              <w:rPr>
+                <w:rFonts w:ascii="Arial" w:hAnsi="Arial" w:cs="Arial"/>
+                <w:b/>
+                <w:sz w:val="14"/>
+                <w:szCs w:val="14"/>
+              </w:rPr>
+              <w:t xml:space="preserve">Median</w:t>
+            </w:r>
+          </w:p>
+        </w:tc>
+        <w:tc>
+          <w:tcPr>
+            <w:tcW w:w="1010" w:type="dxa"/>
+            <w:shd w:val="clear" w:color="auto" w:fill="D9D9D9"/>
+            <w:vAlign w:val="center"/>
+          </w:tcPr>
+          <w:p>
+            <w:pPr>
+              <w:spacing w:before="0" w:after="0" w:line="240" w:lineRule="auto"/>
+              <w:jc w:val="right"/>
+            </w:pPr>
+            <w:r>
+              <w:rPr>
+                <w:rFonts w:ascii="Arial" w:hAnsi="Arial" w:cs="Arial"/>
+                <w:b/>
+                <w:sz w:val="14"/>
+                <w:szCs w:val="14"/>
+              </w:rPr>
+              <w:t xml:space="preserve">$14.00</w:t>
+            </w:r>
+          </w:p>
+        </w:tc>
+      </w:tr>
+      <w:tr>
+        <w:trPr>
+          <w:cantSplit/>
+        </w:trPr>
+        <w:tc>
+          <w:tcPr>
+            <w:tcW w:w="9260" w:type="dxa"/>
+            <w:gridSpan w:val="10"/>
+            <w:vAlign w:val="center"/>
+          </w:tcPr>
+          <w:p>
+            <w:pPr>
+              <w:spacing w:before="0" w:after="0" w:line="240" w:lineRule="auto"/>
+              <w:jc w:val="left"/>
+            </w:pPr>
+            <w:r>
+              <w:rPr>
+                <w:rFonts w:ascii="Arial" w:hAnsi="Arial" w:cs="Arial"/>
+                <w:i/>
+                <w:sz w:val="13"/>
+                <w:szCs w:val="13"/>
+              </w:rPr>
+              <w:t xml:space="preserve">Source: CoStar lease comparables (printed 9/22/2026); asking rents. MG leases adjusted -$4.00/SF to NNN.</w:t>
+            </w:r>
+          </w:p>
+        </w:tc>
+      </w:tr>
+    </w:tbl>
     <w:p>
       <w:pPr>
         <w:pStyle w:val="Heading3"/>
@@ -18455,9 +21985,44 @@
           <w:rFonts w:ascii="Segoe UI" w:eastAsia="Times New Roman" w:hAnsi="Segoe UI" w:cs="Segoe UI"/>
           <w:sz w:val="21"/>
           <w:szCs w:val="21"/>
+        </w:rPr>
+        <w:t xml:space="preserve">The comparable leases are asking rents of $13.00 to $20.00 per square foot (CoStar reports effective rents as withheld). Comparables 4 and 5 feature modified gross lease structures; therefore, a $4.00 expense adjustment is applied to convert them to a triple-net basis. After adjustment, the comparables range from $9.00 to $20.00 per square foot, with an average of $13.30 and a median of $14.00 per square foot. Comparable 1, a 3,985 SF flex suite at 5200-5280 Broadway about one-half mile from the subject, was signed at the date of value at $20.00 NNN and sets the upper end; Comparables 2 and 3, 2024 NNN leases of small industrial suites at 913 E 75th Ave, are the most similar in size and use at $14.00 NNN. Market rent for the subject is concluded at </w:t>
+      </w:r>
+      <w:r>
+        <w:rPr>
+          <w:rFonts w:ascii="Segoe UI" w:eastAsia="Times New Roman" w:hAnsi="Segoe UI" w:cs="Segoe UI"/>
+          <w:sz w:val="21"/>
+          <w:szCs w:val="21"/>
           <w:highlight w:val="yellow"/>
         </w:rPr>
-        <w:t xml:space="preserve">Rent comparables pending – the lease comparable table, rent discussion and adjustments will be completed when the rent comparables are received.</w:t>
+        <w:t xml:space="preserve">$14.00 per square foot, NNN</w:t>
+      </w:r>
+      <w:r>
+        <w:rPr>
+          <w:rFonts w:ascii="Segoe UI" w:eastAsia="Times New Roman" w:hAnsi="Segoe UI" w:cs="Segoe UI"/>
+          <w:sz w:val="21"/>
+          <w:szCs w:val="21"/>
+        </w:rPr>
+        <w:t xml:space="preserve">.</w:t>
+      </w:r>
+    </w:p>
+    <w:p>
+      <w:pPr>
+        <w:spacing w:after="0" w:line="300" w:lineRule="atLeast"/>
+        <w:jc w:val="left"/>
+        <w:rPr>
+          <w:rFonts w:ascii="Segoe UI" w:eastAsia="Times New Roman" w:hAnsi="Segoe UI" w:cs="Segoe UI"/>
+          <w:sz w:val="21"/>
+          <w:szCs w:val="21"/>
+        </w:rPr>
+      </w:pPr>
+      <w:r>
+        <w:rPr>
+          <w:rFonts w:ascii="Segoe UI" w:eastAsia="Times New Roman" w:hAnsi="Segoe UI" w:cs="Segoe UI"/>
+          <w:sz w:val="21"/>
+          <w:szCs w:val="21"/>
+        </w:rPr>
+        <w:t xml:space="preserve">Ownership’s appeal submission reports contract rent of $4,195 per month in 2023 and $4,625 per month in 2024 ($55,500 per year, or $19.82 per square foot), with the landlord paying property taxes, insurance and water/sewer. Ownership totals $72,946 of expenses over the two years and concludes a “gross profit” of about $16,000 per year; however, that total includes a $22,350 roof replacement, which is a capital expenditure, and tax-preparation and accounting fees, which are owner-entity costs rather than property operating expenses. Excluding those items, the 2024 operating expenses were $25,685 and the actual net operating income was $29,815, consistent with the $28,066 market NOI estimated below.</w:t>
       </w:r>
     </w:p>
     <w:p>
@@ -18622,18 +22187,1195 @@
         </w:drawing>
       </w:r>
     </w:p>
-    <w:p>
-      <w:pPr>
-        <w:spacing w:before="120" w:after="120"/>
-      </w:pPr>
-      <w:r>
-        <w:rPr>
-          <w:sz w:val="20"/>
-          <w:highlight w:val="yellow"/>
-        </w:rPr>
-        <w:t xml:space="preserve">[Income Capitalization Approach pro forma – pending receipt of the rent comparables]</w:t>
-      </w:r>
-    </w:p>
+    <w:tbl>
+      <w:tblPr>
+        <w:tblW w:w="8300" w:type="dxa"/>
+        <w:jc w:val="center"/>
+        <w:tblBorders>
+          <w:top w:val="single" w:sz="4" w:space="0" w:color="BFBFBF"/>
+          <w:bottom w:val="single" w:sz="4" w:space="0" w:color="BFBFBF"/>
+          <w:insideH w:val="single" w:sz="2" w:space="0" w:color="D9D9D9"/>
+        </w:tblBorders>
+        <w:tblLayout w:type="fixed"/>
+        <w:tblCellMar>
+          <w:left w:w="60" w:type="dxa"/>
+          <w:right w:w="60" w:type="dxa"/>
+        </w:tblCellMar>
+      </w:tblPr>
+      <w:tblGrid>
+        <w:gridCol w:w="4400"/>
+        <w:gridCol w:w="1200"/>
+        <w:gridCol w:w="1500"/>
+        <w:gridCol w:w="1200"/>
+      </w:tblGrid>
+      <w:tr>
+        <w:trPr>
+          <w:cantSplit/>
+        </w:trPr>
+        <w:tc>
+          <w:tcPr>
+            <w:tcW w:w="8300" w:type="dxa"/>
+            <w:gridSpan w:val="4"/>
+            <w:shd w:val="clear" w:color="auto" w:fill="005710"/>
+            <w:vAlign w:val="center"/>
+          </w:tcPr>
+          <w:p>
+            <w:pPr>
+              <w:spacing w:before="0" w:after="0" w:line="240" w:lineRule="auto"/>
+              <w:jc w:val="center"/>
+            </w:pPr>
+            <w:r>
+              <w:rPr>
+                <w:rFonts w:ascii="Arial" w:hAnsi="Arial" w:cs="Arial"/>
+                <w:b/>
+                <w:color w:val="FFFFFF"/>
+                <w:sz w:val="16"/>
+                <w:szCs w:val="16"/>
+              </w:rPr>
+              <w:t xml:space="preserve">INCOME CAPITALIZATION APPROACH</w:t>
+            </w:r>
+          </w:p>
+        </w:tc>
+      </w:tr>
+      <w:tr>
+        <w:trPr>
+          <w:cantSplit/>
+        </w:trPr>
+        <w:tc>
+          <w:tcPr>
+            <w:tcW w:w="4400" w:type="dxa"/>
+            <w:vAlign w:val="center"/>
+          </w:tcPr>
+          <w:p>
+            <w:pPr>
+              <w:spacing w:before="0" w:after="0" w:line="240" w:lineRule="auto"/>
+              <w:jc w:val="left"/>
+            </w:pPr>
+            <w:r>
+              <w:rPr>
+                <w:rFonts w:ascii="Arial" w:hAnsi="Arial" w:cs="Arial"/>
+                <w:sz w:val="15"/>
+                <w:szCs w:val="15"/>
+              </w:rPr>
+              <w:t xml:space="preserve">Subject Building Area (SF)</w:t>
+            </w:r>
+          </w:p>
+        </w:tc>
+        <w:tc>
+          <w:tcPr>
+            <w:tcW w:w="1200" w:type="dxa"/>
+            <w:vAlign w:val="center"/>
+          </w:tcPr>
+          <w:p>
+            <w:pPr>
+              <w:spacing w:before="0" w:after="0" w:line="240" w:lineRule="auto"/>
+              <w:jc w:val="right"/>
+            </w:pPr>
+            <w:r>
+              <w:rPr>
+                <w:rFonts w:ascii="Arial" w:hAnsi="Arial" w:cs="Arial"/>
+                <w:sz w:val="15"/>
+                <w:szCs w:val="15"/>
+              </w:rPr>
+              <w:t xml:space="preserve"/>
+            </w:r>
+          </w:p>
+        </w:tc>
+        <w:tc>
+          <w:tcPr>
+            <w:tcW w:w="1500" w:type="dxa"/>
+            <w:vAlign w:val="center"/>
+          </w:tcPr>
+          <w:p>
+            <w:pPr>
+              <w:spacing w:before="0" w:after="0" w:line="240" w:lineRule="auto"/>
+              <w:jc w:val="right"/>
+            </w:pPr>
+            <w:r>
+              <w:rPr>
+                <w:rFonts w:ascii="Arial" w:hAnsi="Arial" w:cs="Arial"/>
+                <w:sz w:val="15"/>
+                <w:szCs w:val="15"/>
+              </w:rPr>
+              <w:t xml:space="preserve">2,800</w:t>
+            </w:r>
+          </w:p>
+        </w:tc>
+        <w:tc>
+          <w:tcPr>
+            <w:tcW w:w="1200" w:type="dxa"/>
+            <w:vAlign w:val="center"/>
+          </w:tcPr>
+          <w:p>
+            <w:pPr>
+              <w:spacing w:before="0" w:after="0" w:line="240" w:lineRule="auto"/>
+              <w:jc w:val="right"/>
+            </w:pPr>
+            <w:r>
+              <w:rPr>
+                <w:rFonts w:ascii="Arial" w:hAnsi="Arial" w:cs="Arial"/>
+                <w:sz w:val="15"/>
+                <w:szCs w:val="15"/>
+              </w:rPr>
+              <w:t xml:space="preserve"/>
+            </w:r>
+          </w:p>
+        </w:tc>
+      </w:tr>
+      <w:tr>
+        <w:trPr>
+          <w:cantSplit/>
+        </w:trPr>
+        <w:tc>
+          <w:tcPr>
+            <w:tcW w:w="8300" w:type="dxa"/>
+            <w:gridSpan w:val="4"/>
+            <w:shd w:val="clear" w:color="auto" w:fill="808080"/>
+            <w:vAlign w:val="center"/>
+          </w:tcPr>
+          <w:p>
+            <w:pPr>
+              <w:spacing w:before="0" w:after="0" w:line="240" w:lineRule="auto"/>
+              <w:jc w:val="left"/>
+            </w:pPr>
+            <w:r>
+              <w:rPr>
+                <w:rFonts w:ascii="Arial" w:hAnsi="Arial" w:cs="Arial"/>
+                <w:b/>
+                <w:color w:val="FFFFFF"/>
+                <w:sz w:val="15"/>
+                <w:szCs w:val="15"/>
+              </w:rPr>
+              <w:t xml:space="preserve">Pro Forma Operating Statement</w:t>
+            </w:r>
+          </w:p>
+        </w:tc>
+      </w:tr>
+      <w:tr>
+        <w:trPr>
+          <w:cantSplit/>
+        </w:trPr>
+        <w:tc>
+          <w:tcPr>
+            <w:tcW w:w="4400" w:type="dxa"/>
+            <w:vAlign w:val="center"/>
+          </w:tcPr>
+          <w:p>
+            <w:pPr>
+              <w:spacing w:before="0" w:after="0" w:line="240" w:lineRule="auto"/>
+              <w:jc w:val="left"/>
+            </w:pPr>
+            <w:r>
+              <w:rPr>
+                <w:rFonts w:ascii="Arial" w:hAnsi="Arial" w:cs="Arial"/>
+                <w:b/>
+                <w:sz w:val="15"/>
+                <w:szCs w:val="15"/>
+              </w:rPr>
+              <w:t xml:space="preserve"/>
+            </w:r>
+          </w:p>
+        </w:tc>
+        <w:tc>
+          <w:tcPr>
+            <w:tcW w:w="1200" w:type="dxa"/>
+            <w:vAlign w:val="center"/>
+          </w:tcPr>
+          <w:p>
+            <w:pPr>
+              <w:spacing w:before="0" w:after="0" w:line="240" w:lineRule="auto"/>
+              <w:jc w:val="right"/>
+            </w:pPr>
+            <w:r>
+              <w:rPr>
+                <w:rFonts w:ascii="Arial" w:hAnsi="Arial" w:cs="Arial"/>
+                <w:b/>
+                <w:sz w:val="15"/>
+                <w:szCs w:val="15"/>
+              </w:rPr>
+              <w:t xml:space="preserve">Rate</w:t>
+            </w:r>
+          </w:p>
+        </w:tc>
+        <w:tc>
+          <w:tcPr>
+            <w:tcW w:w="1500" w:type="dxa"/>
+            <w:vAlign w:val="center"/>
+          </w:tcPr>
+          <w:p>
+            <w:pPr>
+              <w:spacing w:before="0" w:after="0" w:line="240" w:lineRule="auto"/>
+              <w:jc w:val="right"/>
+            </w:pPr>
+            <w:r>
+              <w:rPr>
+                <w:rFonts w:ascii="Arial" w:hAnsi="Arial" w:cs="Arial"/>
+                <w:b/>
+                <w:sz w:val="15"/>
+                <w:szCs w:val="15"/>
+              </w:rPr>
+              <w:t xml:space="preserve">Total</w:t>
+            </w:r>
+          </w:p>
+        </w:tc>
+        <w:tc>
+          <w:tcPr>
+            <w:tcW w:w="1200" w:type="dxa"/>
+            <w:vAlign w:val="center"/>
+          </w:tcPr>
+          <w:p>
+            <w:pPr>
+              <w:spacing w:before="0" w:after="0" w:line="240" w:lineRule="auto"/>
+              <w:jc w:val="right"/>
+            </w:pPr>
+            <w:r>
+              <w:rPr>
+                <w:rFonts w:ascii="Arial" w:hAnsi="Arial" w:cs="Arial"/>
+                <w:b/>
+                <w:sz w:val="15"/>
+                <w:szCs w:val="15"/>
+              </w:rPr>
+              <w:t xml:space="preserve">$/SF</w:t>
+            </w:r>
+          </w:p>
+        </w:tc>
+      </w:tr>
+      <w:tr>
+        <w:trPr>
+          <w:cantSplit/>
+        </w:trPr>
+        <w:tc>
+          <w:tcPr>
+            <w:tcW w:w="4400" w:type="dxa"/>
+            <w:vAlign w:val="center"/>
+          </w:tcPr>
+          <w:p>
+            <w:pPr>
+              <w:spacing w:before="0" w:after="0" w:line="240" w:lineRule="auto"/>
+              <w:jc w:val="left"/>
+            </w:pPr>
+            <w:r>
+              <w:rPr>
+                <w:rFonts w:ascii="Arial" w:hAnsi="Arial" w:cs="Arial"/>
+                <w:sz w:val="15"/>
+                <w:szCs w:val="15"/>
+              </w:rPr>
+              <w:t xml:space="preserve">Potential Gross Rental Income (2,800 SF x $14.00 NNN)</w:t>
+            </w:r>
+          </w:p>
+        </w:tc>
+        <w:tc>
+          <w:tcPr>
+            <w:tcW w:w="1200" w:type="dxa"/>
+            <w:vAlign w:val="center"/>
+          </w:tcPr>
+          <w:p>
+            <w:pPr>
+              <w:spacing w:before="0" w:after="0" w:line="240" w:lineRule="auto"/>
+              <w:jc w:val="right"/>
+            </w:pPr>
+            <w:r>
+              <w:rPr>
+                <w:rFonts w:ascii="Arial" w:hAnsi="Arial" w:cs="Arial"/>
+                <w:sz w:val="15"/>
+                <w:szCs w:val="15"/>
+              </w:rPr>
+              <w:t xml:space="preserve"/>
+            </w:r>
+          </w:p>
+        </w:tc>
+        <w:tc>
+          <w:tcPr>
+            <w:tcW w:w="1500" w:type="dxa"/>
+            <w:vAlign w:val="center"/>
+          </w:tcPr>
+          <w:p>
+            <w:pPr>
+              <w:spacing w:before="0" w:after="0" w:line="240" w:lineRule="auto"/>
+              <w:jc w:val="right"/>
+            </w:pPr>
+            <w:r>
+              <w:rPr>
+                <w:rFonts w:ascii="Arial" w:hAnsi="Arial" w:cs="Arial"/>
+                <w:sz w:val="15"/>
+                <w:szCs w:val="15"/>
+              </w:rPr>
+              <w:t xml:space="preserve">$39,200</w:t>
+            </w:r>
+          </w:p>
+        </w:tc>
+        <w:tc>
+          <w:tcPr>
+            <w:tcW w:w="1200" w:type="dxa"/>
+            <w:vAlign w:val="center"/>
+          </w:tcPr>
+          <w:p>
+            <w:pPr>
+              <w:spacing w:before="0" w:after="0" w:line="240" w:lineRule="auto"/>
+              <w:jc w:val="right"/>
+            </w:pPr>
+            <w:r>
+              <w:rPr>
+                <w:rFonts w:ascii="Arial" w:hAnsi="Arial" w:cs="Arial"/>
+                <w:sz w:val="15"/>
+                <w:szCs w:val="15"/>
+              </w:rPr>
+              <w:t xml:space="preserve">$14.00</w:t>
+            </w:r>
+          </w:p>
+        </w:tc>
+      </w:tr>
+      <w:tr>
+        <w:trPr>
+          <w:cantSplit/>
+        </w:trPr>
+        <w:tc>
+          <w:tcPr>
+            <w:tcW w:w="4400" w:type="dxa"/>
+            <w:vAlign w:val="center"/>
+          </w:tcPr>
+          <w:p>
+            <w:pPr>
+              <w:spacing w:before="0" w:after="0" w:line="240" w:lineRule="auto"/>
+              <w:jc w:val="left"/>
+            </w:pPr>
+            <w:r>
+              <w:rPr>
+                <w:rFonts w:ascii="Arial" w:hAnsi="Arial" w:cs="Arial"/>
+                <w:sz w:val="15"/>
+                <w:szCs w:val="15"/>
+              </w:rPr>
+              <w:t xml:space="preserve">Less: Vacancy &amp; Collection Loss</w:t>
+            </w:r>
+          </w:p>
+        </w:tc>
+        <w:tc>
+          <w:tcPr>
+            <w:tcW w:w="1200" w:type="dxa"/>
+            <w:vAlign w:val="center"/>
+          </w:tcPr>
+          <w:p>
+            <w:pPr>
+              <w:spacing w:before="0" w:after="0" w:line="240" w:lineRule="auto"/>
+              <w:jc w:val="right"/>
+            </w:pPr>
+            <w:r>
+              <w:rPr>
+                <w:rFonts w:ascii="Arial" w:hAnsi="Arial" w:cs="Arial"/>
+                <w:sz w:val="15"/>
+                <w:szCs w:val="15"/>
+              </w:rPr>
+              <w:t xml:space="preserve">10.0%</w:t>
+            </w:r>
+          </w:p>
+        </w:tc>
+        <w:tc>
+          <w:tcPr>
+            <w:tcW w:w="1500" w:type="dxa"/>
+            <w:vAlign w:val="center"/>
+          </w:tcPr>
+          <w:p>
+            <w:pPr>
+              <w:spacing w:before="0" w:after="0" w:line="240" w:lineRule="auto"/>
+              <w:jc w:val="right"/>
+            </w:pPr>
+            <w:r>
+              <w:rPr>
+                <w:rFonts w:ascii="Arial" w:hAnsi="Arial" w:cs="Arial"/>
+                <w:sz w:val="15"/>
+                <w:szCs w:val="15"/>
+              </w:rPr>
+              <w:t xml:space="preserve">($3,920)</w:t>
+            </w:r>
+          </w:p>
+        </w:tc>
+        <w:tc>
+          <w:tcPr>
+            <w:tcW w:w="1200" w:type="dxa"/>
+            <w:vAlign w:val="center"/>
+          </w:tcPr>
+          <w:p>
+            <w:pPr>
+              <w:spacing w:before="0" w:after="0" w:line="240" w:lineRule="auto"/>
+              <w:jc w:val="right"/>
+            </w:pPr>
+            <w:r>
+              <w:rPr>
+                <w:rFonts w:ascii="Arial" w:hAnsi="Arial" w:cs="Arial"/>
+                <w:sz w:val="15"/>
+                <w:szCs w:val="15"/>
+              </w:rPr>
+              <w:t xml:space="preserve">($1.40)</w:t>
+            </w:r>
+          </w:p>
+        </w:tc>
+      </w:tr>
+      <w:tr>
+        <w:trPr>
+          <w:cantSplit/>
+        </w:trPr>
+        <w:tc>
+          <w:tcPr>
+            <w:tcW w:w="4400" w:type="dxa"/>
+            <w:shd w:val="clear" w:color="auto" w:fill="D9D9D9"/>
+            <w:vAlign w:val="center"/>
+          </w:tcPr>
+          <w:p>
+            <w:pPr>
+              <w:spacing w:before="0" w:after="0" w:line="240" w:lineRule="auto"/>
+              <w:jc w:val="left"/>
+            </w:pPr>
+            <w:r>
+              <w:rPr>
+                <w:rFonts w:ascii="Arial" w:hAnsi="Arial" w:cs="Arial"/>
+                <w:b/>
+                <w:sz w:val="15"/>
+                <w:szCs w:val="15"/>
+              </w:rPr>
+              <w:t xml:space="preserve">Effective Gross Income (EGI)</w:t>
+            </w:r>
+          </w:p>
+        </w:tc>
+        <w:tc>
+          <w:tcPr>
+            <w:tcW w:w="1200" w:type="dxa"/>
+            <w:shd w:val="clear" w:color="auto" w:fill="D9D9D9"/>
+            <w:vAlign w:val="center"/>
+          </w:tcPr>
+          <w:p>
+            <w:pPr>
+              <w:spacing w:before="0" w:after="0" w:line="240" w:lineRule="auto"/>
+              <w:jc w:val="right"/>
+            </w:pPr>
+            <w:r>
+              <w:rPr>
+                <w:rFonts w:ascii="Arial" w:hAnsi="Arial" w:cs="Arial"/>
+                <w:b/>
+                <w:sz w:val="15"/>
+                <w:szCs w:val="15"/>
+              </w:rPr>
+              <w:t xml:space="preserve"/>
+            </w:r>
+          </w:p>
+        </w:tc>
+        <w:tc>
+          <w:tcPr>
+            <w:tcW w:w="1500" w:type="dxa"/>
+            <w:shd w:val="clear" w:color="auto" w:fill="D9D9D9"/>
+            <w:vAlign w:val="center"/>
+          </w:tcPr>
+          <w:p>
+            <w:pPr>
+              <w:spacing w:before="0" w:after="0" w:line="240" w:lineRule="auto"/>
+              <w:jc w:val="right"/>
+            </w:pPr>
+            <w:r>
+              <w:rPr>
+                <w:rFonts w:ascii="Arial" w:hAnsi="Arial" w:cs="Arial"/>
+                <w:b/>
+                <w:sz w:val="15"/>
+                <w:szCs w:val="15"/>
+              </w:rPr>
+              <w:t xml:space="preserve">$35,280</w:t>
+            </w:r>
+          </w:p>
+        </w:tc>
+        <w:tc>
+          <w:tcPr>
+            <w:tcW w:w="1200" w:type="dxa"/>
+            <w:shd w:val="clear" w:color="auto" w:fill="D9D9D9"/>
+            <w:vAlign w:val="center"/>
+          </w:tcPr>
+          <w:p>
+            <w:pPr>
+              <w:spacing w:before="0" w:after="0" w:line="240" w:lineRule="auto"/>
+              <w:jc w:val="right"/>
+            </w:pPr>
+            <w:r>
+              <w:rPr>
+                <w:rFonts w:ascii="Arial" w:hAnsi="Arial" w:cs="Arial"/>
+                <w:b/>
+                <w:sz w:val="15"/>
+                <w:szCs w:val="15"/>
+              </w:rPr>
+              <w:t xml:space="preserve">$12.60</w:t>
+            </w:r>
+          </w:p>
+        </w:tc>
+      </w:tr>
+      <w:tr>
+        <w:trPr>
+          <w:cantSplit/>
+        </w:trPr>
+        <w:tc>
+          <w:tcPr>
+            <w:tcW w:w="4400" w:type="dxa"/>
+            <w:vAlign w:val="center"/>
+          </w:tcPr>
+          <w:p>
+            <w:pPr>
+              <w:spacing w:before="0" w:after="0" w:line="240" w:lineRule="auto"/>
+              <w:jc w:val="left"/>
+            </w:pPr>
+            <w:r>
+              <w:rPr>
+                <w:rFonts w:ascii="Arial" w:hAnsi="Arial" w:cs="Arial"/>
+                <w:sz w:val="15"/>
+                <w:szCs w:val="15"/>
+              </w:rPr>
+              <w:t xml:space="preserve">Owner's Expenses (reserves, management, non-recoverables)</w:t>
+            </w:r>
+          </w:p>
+        </w:tc>
+        <w:tc>
+          <w:tcPr>
+            <w:tcW w:w="1200" w:type="dxa"/>
+            <w:vAlign w:val="center"/>
+          </w:tcPr>
+          <w:p>
+            <w:pPr>
+              <w:spacing w:before="0" w:after="0" w:line="240" w:lineRule="auto"/>
+              <w:jc w:val="right"/>
+            </w:pPr>
+            <w:r>
+              <w:rPr>
+                <w:rFonts w:ascii="Arial" w:hAnsi="Arial" w:cs="Arial"/>
+                <w:sz w:val="15"/>
+                <w:szCs w:val="15"/>
+              </w:rPr>
+              <w:t xml:space="preserve">10.0%</w:t>
+            </w:r>
+          </w:p>
+        </w:tc>
+        <w:tc>
+          <w:tcPr>
+            <w:tcW w:w="1500" w:type="dxa"/>
+            <w:vAlign w:val="center"/>
+          </w:tcPr>
+          <w:p>
+            <w:pPr>
+              <w:spacing w:before="0" w:after="0" w:line="240" w:lineRule="auto"/>
+              <w:jc w:val="right"/>
+            </w:pPr>
+            <w:r>
+              <w:rPr>
+                <w:rFonts w:ascii="Arial" w:hAnsi="Arial" w:cs="Arial"/>
+                <w:sz w:val="15"/>
+                <w:szCs w:val="15"/>
+              </w:rPr>
+              <w:t xml:space="preserve">($3,528)</w:t>
+            </w:r>
+          </w:p>
+        </w:tc>
+        <w:tc>
+          <w:tcPr>
+            <w:tcW w:w="1200" w:type="dxa"/>
+            <w:vAlign w:val="center"/>
+          </w:tcPr>
+          <w:p>
+            <w:pPr>
+              <w:spacing w:before="0" w:after="0" w:line="240" w:lineRule="auto"/>
+              <w:jc w:val="right"/>
+            </w:pPr>
+            <w:r>
+              <w:rPr>
+                <w:rFonts w:ascii="Arial" w:hAnsi="Arial" w:cs="Arial"/>
+                <w:sz w:val="15"/>
+                <w:szCs w:val="15"/>
+              </w:rPr>
+              <w:t xml:space="preserve">($1.26)</w:t>
+            </w:r>
+          </w:p>
+        </w:tc>
+      </w:tr>
+      <w:tr>
+        <w:trPr>
+          <w:cantSplit/>
+        </w:trPr>
+        <w:tc>
+          <w:tcPr>
+            <w:tcW w:w="4400" w:type="dxa"/>
+            <w:vAlign w:val="center"/>
+          </w:tcPr>
+          <w:p>
+            <w:pPr>
+              <w:spacing w:before="0" w:after="0" w:line="240" w:lineRule="auto"/>
+              <w:jc w:val="left"/>
+            </w:pPr>
+            <w:r>
+              <w:rPr>
+                <w:rFonts w:ascii="Arial" w:hAnsi="Arial" w:cs="Arial"/>
+                <w:sz w:val="15"/>
+                <w:szCs w:val="15"/>
+              </w:rPr>
+              <w:t xml:space="preserve">Expense Recovery Loss During Vacancy</w:t>
+            </w:r>
+          </w:p>
+        </w:tc>
+        <w:tc>
+          <w:tcPr>
+            <w:tcW w:w="1200" w:type="dxa"/>
+            <w:vAlign w:val="center"/>
+          </w:tcPr>
+          <w:p>
+            <w:pPr>
+              <w:spacing w:before="0" w:after="0" w:line="240" w:lineRule="auto"/>
+              <w:jc w:val="right"/>
+            </w:pPr>
+            <w:r>
+              <w:rPr>
+                <w:rFonts w:ascii="Arial" w:hAnsi="Arial" w:cs="Arial"/>
+                <w:sz w:val="15"/>
+                <w:szCs w:val="15"/>
+              </w:rPr>
+              <w:t xml:space="preserve">10.4%</w:t>
+            </w:r>
+          </w:p>
+        </w:tc>
+        <w:tc>
+          <w:tcPr>
+            <w:tcW w:w="1500" w:type="dxa"/>
+            <w:vAlign w:val="center"/>
+          </w:tcPr>
+          <w:p>
+            <w:pPr>
+              <w:spacing w:before="0" w:after="0" w:line="240" w:lineRule="auto"/>
+              <w:jc w:val="right"/>
+            </w:pPr>
+            <w:r>
+              <w:rPr>
+                <w:rFonts w:ascii="Arial" w:hAnsi="Arial" w:cs="Arial"/>
+                <w:sz w:val="15"/>
+                <w:szCs w:val="15"/>
+              </w:rPr>
+              <w:t xml:space="preserve">($3,686)</w:t>
+            </w:r>
+          </w:p>
+        </w:tc>
+        <w:tc>
+          <w:tcPr>
+            <w:tcW w:w="1200" w:type="dxa"/>
+            <w:vAlign w:val="center"/>
+          </w:tcPr>
+          <w:p>
+            <w:pPr>
+              <w:spacing w:before="0" w:after="0" w:line="240" w:lineRule="auto"/>
+              <w:jc w:val="right"/>
+            </w:pPr>
+            <w:r>
+              <w:rPr>
+                <w:rFonts w:ascii="Arial" w:hAnsi="Arial" w:cs="Arial"/>
+                <w:sz w:val="15"/>
+                <w:szCs w:val="15"/>
+              </w:rPr>
+              <w:t xml:space="preserve">($1.32)</w:t>
+            </w:r>
+          </w:p>
+        </w:tc>
+      </w:tr>
+      <w:tr>
+        <w:trPr>
+          <w:cantSplit/>
+        </w:trPr>
+        <w:tc>
+          <w:tcPr>
+            <w:tcW w:w="4400" w:type="dxa"/>
+            <w:vAlign w:val="center"/>
+          </w:tcPr>
+          <w:p>
+            <w:pPr>
+              <w:spacing w:before="0" w:after="0" w:line="240" w:lineRule="auto"/>
+              <w:jc w:val="left"/>
+            </w:pPr>
+            <w:r>
+              <w:rPr>
+                <w:rFonts w:ascii="Arial" w:hAnsi="Arial" w:cs="Arial"/>
+                <w:b/>
+                <w:sz w:val="15"/>
+                <w:szCs w:val="15"/>
+              </w:rPr>
+              <w:t xml:space="preserve">Total Expenses</w:t>
+            </w:r>
+          </w:p>
+        </w:tc>
+        <w:tc>
+          <w:tcPr>
+            <w:tcW w:w="1200" w:type="dxa"/>
+            <w:vAlign w:val="center"/>
+          </w:tcPr>
+          <w:p>
+            <w:pPr>
+              <w:spacing w:before="0" w:after="0" w:line="240" w:lineRule="auto"/>
+              <w:jc w:val="right"/>
+            </w:pPr>
+            <w:r>
+              <w:rPr>
+                <w:rFonts w:ascii="Arial" w:hAnsi="Arial" w:cs="Arial"/>
+                <w:b/>
+                <w:sz w:val="15"/>
+                <w:szCs w:val="15"/>
+              </w:rPr>
+              <w:t xml:space="preserve"/>
+            </w:r>
+          </w:p>
+        </w:tc>
+        <w:tc>
+          <w:tcPr>
+            <w:tcW w:w="1500" w:type="dxa"/>
+            <w:vAlign w:val="center"/>
+          </w:tcPr>
+          <w:p>
+            <w:pPr>
+              <w:spacing w:before="0" w:after="0" w:line="240" w:lineRule="auto"/>
+              <w:jc w:val="right"/>
+            </w:pPr>
+            <w:r>
+              <w:rPr>
+                <w:rFonts w:ascii="Arial" w:hAnsi="Arial" w:cs="Arial"/>
+                <w:b/>
+                <w:sz w:val="15"/>
+                <w:szCs w:val="15"/>
+              </w:rPr>
+              <w:t xml:space="preserve">($7,214)</w:t>
+            </w:r>
+          </w:p>
+        </w:tc>
+        <w:tc>
+          <w:tcPr>
+            <w:tcW w:w="1200" w:type="dxa"/>
+            <w:vAlign w:val="center"/>
+          </w:tcPr>
+          <w:p>
+            <w:pPr>
+              <w:spacing w:before="0" w:after="0" w:line="240" w:lineRule="auto"/>
+              <w:jc w:val="right"/>
+            </w:pPr>
+            <w:r>
+              <w:rPr>
+                <w:rFonts w:ascii="Arial" w:hAnsi="Arial" w:cs="Arial"/>
+                <w:b/>
+                <w:sz w:val="15"/>
+                <w:szCs w:val="15"/>
+              </w:rPr>
+              <w:t xml:space="preserve">($2.58)</w:t>
+            </w:r>
+          </w:p>
+        </w:tc>
+      </w:tr>
+      <w:tr>
+        <w:trPr>
+          <w:cantSplit/>
+        </w:trPr>
+        <w:tc>
+          <w:tcPr>
+            <w:tcW w:w="4400" w:type="dxa"/>
+            <w:shd w:val="clear" w:color="auto" w:fill="D9D9D9"/>
+            <w:vAlign w:val="center"/>
+          </w:tcPr>
+          <w:p>
+            <w:pPr>
+              <w:spacing w:before="0" w:after="0" w:line="240" w:lineRule="auto"/>
+              <w:jc w:val="left"/>
+            </w:pPr>
+            <w:r>
+              <w:rPr>
+                <w:rFonts w:ascii="Arial" w:hAnsi="Arial" w:cs="Arial"/>
+                <w:b/>
+                <w:sz w:val="15"/>
+                <w:szCs w:val="15"/>
+              </w:rPr>
+              <w:t xml:space="preserve">Net Operating Income (NOI)</w:t>
+            </w:r>
+          </w:p>
+        </w:tc>
+        <w:tc>
+          <w:tcPr>
+            <w:tcW w:w="1200" w:type="dxa"/>
+            <w:shd w:val="clear" w:color="auto" w:fill="D9D9D9"/>
+            <w:vAlign w:val="center"/>
+          </w:tcPr>
+          <w:p>
+            <w:pPr>
+              <w:spacing w:before="0" w:after="0" w:line="240" w:lineRule="auto"/>
+              <w:jc w:val="right"/>
+            </w:pPr>
+            <w:r>
+              <w:rPr>
+                <w:rFonts w:ascii="Arial" w:hAnsi="Arial" w:cs="Arial"/>
+                <w:b/>
+                <w:sz w:val="15"/>
+                <w:szCs w:val="15"/>
+              </w:rPr>
+              <w:t xml:space="preserve"/>
+            </w:r>
+          </w:p>
+        </w:tc>
+        <w:tc>
+          <w:tcPr>
+            <w:tcW w:w="1500" w:type="dxa"/>
+            <w:shd w:val="clear" w:color="auto" w:fill="D9D9D9"/>
+            <w:vAlign w:val="center"/>
+          </w:tcPr>
+          <w:p>
+            <w:pPr>
+              <w:spacing w:before="0" w:after="0" w:line="240" w:lineRule="auto"/>
+              <w:jc w:val="right"/>
+            </w:pPr>
+            <w:r>
+              <w:rPr>
+                <w:rFonts w:ascii="Arial" w:hAnsi="Arial" w:cs="Arial"/>
+                <w:b/>
+                <w:sz w:val="15"/>
+                <w:szCs w:val="15"/>
+              </w:rPr>
+              <w:t xml:space="preserve">$28,066</w:t>
+            </w:r>
+          </w:p>
+        </w:tc>
+        <w:tc>
+          <w:tcPr>
+            <w:tcW w:w="1200" w:type="dxa"/>
+            <w:shd w:val="clear" w:color="auto" w:fill="D9D9D9"/>
+            <w:vAlign w:val="center"/>
+          </w:tcPr>
+          <w:p>
+            <w:pPr>
+              <w:spacing w:before="0" w:after="0" w:line="240" w:lineRule="auto"/>
+              <w:jc w:val="right"/>
+            </w:pPr>
+            <w:r>
+              <w:rPr>
+                <w:rFonts w:ascii="Arial" w:hAnsi="Arial" w:cs="Arial"/>
+                <w:b/>
+                <w:sz w:val="15"/>
+                <w:szCs w:val="15"/>
+              </w:rPr>
+              <w:t xml:space="preserve">$10.02</w:t>
+            </w:r>
+          </w:p>
+        </w:tc>
+      </w:tr>
+      <w:tr>
+        <w:trPr>
+          <w:cantSplit/>
+        </w:trPr>
+        <w:tc>
+          <w:tcPr>
+            <w:tcW w:w="8300" w:type="dxa"/>
+            <w:gridSpan w:val="4"/>
+            <w:shd w:val="clear" w:color="auto" w:fill="808080"/>
+            <w:vAlign w:val="center"/>
+          </w:tcPr>
+          <w:p>
+            <w:pPr>
+              <w:spacing w:before="0" w:after="0" w:line="240" w:lineRule="auto"/>
+              <w:jc w:val="left"/>
+            </w:pPr>
+            <w:r>
+              <w:rPr>
+                <w:rFonts w:ascii="Arial" w:hAnsi="Arial" w:cs="Arial"/>
+                <w:b/>
+                <w:color w:val="FFFFFF"/>
+                <w:sz w:val="15"/>
+                <w:szCs w:val="15"/>
+              </w:rPr>
+              <w:t xml:space="preserve">Direct Capitalization</w:t>
+            </w:r>
+          </w:p>
+        </w:tc>
+      </w:tr>
+      <w:tr>
+        <w:trPr>
+          <w:cantSplit/>
+        </w:trPr>
+        <w:tc>
+          <w:tcPr>
+            <w:tcW w:w="4400" w:type="dxa"/>
+            <w:vAlign w:val="center"/>
+          </w:tcPr>
+          <w:p>
+            <w:pPr>
+              <w:spacing w:before="0" w:after="0" w:line="240" w:lineRule="auto"/>
+              <w:jc w:val="left"/>
+            </w:pPr>
+            <w:r>
+              <w:rPr>
+                <w:rFonts w:ascii="Arial" w:hAnsi="Arial" w:cs="Arial"/>
+                <w:sz w:val="15"/>
+                <w:szCs w:val="15"/>
+              </w:rPr>
+              <w:t xml:space="preserve">Overall Capitalization Rate</w:t>
+            </w:r>
+          </w:p>
+        </w:tc>
+        <w:tc>
+          <w:tcPr>
+            <w:tcW w:w="1200" w:type="dxa"/>
+            <w:vAlign w:val="center"/>
+          </w:tcPr>
+          <w:p>
+            <w:pPr>
+              <w:spacing w:before="0" w:after="0" w:line="240" w:lineRule="auto"/>
+              <w:jc w:val="right"/>
+            </w:pPr>
+            <w:r>
+              <w:rPr>
+                <w:rFonts w:ascii="Arial" w:hAnsi="Arial" w:cs="Arial"/>
+                <w:sz w:val="15"/>
+                <w:szCs w:val="15"/>
+              </w:rPr>
+              <w:t xml:space="preserve">6.00%</w:t>
+            </w:r>
+          </w:p>
+        </w:tc>
+        <w:tc>
+          <w:tcPr>
+            <w:tcW w:w="1500" w:type="dxa"/>
+            <w:vAlign w:val="center"/>
+          </w:tcPr>
+          <w:p>
+            <w:pPr>
+              <w:spacing w:before="0" w:after="0" w:line="240" w:lineRule="auto"/>
+              <w:jc w:val="right"/>
+            </w:pPr>
+            <w:r>
+              <w:rPr>
+                <w:rFonts w:ascii="Arial" w:hAnsi="Arial" w:cs="Arial"/>
+                <w:sz w:val="15"/>
+                <w:szCs w:val="15"/>
+              </w:rPr>
+              <w:t xml:space="preserve"/>
+            </w:r>
+          </w:p>
+        </w:tc>
+        <w:tc>
+          <w:tcPr>
+            <w:tcW w:w="1200" w:type="dxa"/>
+            <w:vAlign w:val="center"/>
+          </w:tcPr>
+          <w:p>
+            <w:pPr>
+              <w:spacing w:before="0" w:after="0" w:line="240" w:lineRule="auto"/>
+              <w:jc w:val="right"/>
+            </w:pPr>
+            <w:r>
+              <w:rPr>
+                <w:rFonts w:ascii="Arial" w:hAnsi="Arial" w:cs="Arial"/>
+                <w:sz w:val="15"/>
+                <w:szCs w:val="15"/>
+              </w:rPr>
+              <w:t xml:space="preserve"/>
+            </w:r>
+          </w:p>
+        </w:tc>
+      </w:tr>
+      <w:tr>
+        <w:trPr>
+          <w:cantSplit/>
+        </w:trPr>
+        <w:tc>
+          <w:tcPr>
+            <w:tcW w:w="4400" w:type="dxa"/>
+            <w:vAlign w:val="center"/>
+          </w:tcPr>
+          <w:p>
+            <w:pPr>
+              <w:spacing w:before="0" w:after="0" w:line="240" w:lineRule="auto"/>
+              <w:jc w:val="left"/>
+            </w:pPr>
+            <w:r>
+              <w:rPr>
+                <w:rFonts w:ascii="Arial" w:hAnsi="Arial" w:cs="Arial"/>
+                <w:sz w:val="15"/>
+                <w:szCs w:val="15"/>
+              </w:rPr>
+              <w:t xml:space="preserve">Sensitivity: 5.75% / 6.00% / 6.25%</w:t>
+            </w:r>
+          </w:p>
+        </w:tc>
+        <w:tc>
+          <w:tcPr>
+            <w:tcW w:w="1200" w:type="dxa"/>
+            <w:vAlign w:val="center"/>
+          </w:tcPr>
+          <w:p>
+            <w:pPr>
+              <w:spacing w:before="0" w:after="0" w:line="240" w:lineRule="auto"/>
+              <w:jc w:val="right"/>
+            </w:pPr>
+            <w:r>
+              <w:rPr>
+                <w:rFonts w:ascii="Arial" w:hAnsi="Arial" w:cs="Arial"/>
+                <w:sz w:val="15"/>
+                <w:szCs w:val="15"/>
+              </w:rPr>
+              <w:t xml:space="preserve"/>
+            </w:r>
+          </w:p>
+        </w:tc>
+        <w:tc>
+          <w:tcPr>
+            <w:tcW w:w="1500" w:type="dxa"/>
+            <w:vAlign w:val="center"/>
+          </w:tcPr>
+          <w:p>
+            <w:pPr>
+              <w:spacing w:before="0" w:after="0" w:line="240" w:lineRule="auto"/>
+              <w:jc w:val="right"/>
+            </w:pPr>
+            <w:r>
+              <w:rPr>
+                <w:rFonts w:ascii="Arial" w:hAnsi="Arial" w:cs="Arial"/>
+                <w:sz w:val="15"/>
+                <w:szCs w:val="15"/>
+              </w:rPr>
+              <w:t xml:space="preserve">$488,107 / $467,769 / $449,058</w:t>
+            </w:r>
+          </w:p>
+        </w:tc>
+        <w:tc>
+          <w:tcPr>
+            <w:tcW w:w="1200" w:type="dxa"/>
+            <w:vAlign w:val="center"/>
+          </w:tcPr>
+          <w:p>
+            <w:pPr>
+              <w:spacing w:before="0" w:after="0" w:line="240" w:lineRule="auto"/>
+              <w:jc w:val="right"/>
+            </w:pPr>
+            <w:r>
+              <w:rPr>
+                <w:rFonts w:ascii="Arial" w:hAnsi="Arial" w:cs="Arial"/>
+                <w:sz w:val="15"/>
+                <w:szCs w:val="15"/>
+              </w:rPr>
+              <w:t xml:space="preserve"/>
+            </w:r>
+          </w:p>
+        </w:tc>
+      </w:tr>
+      <w:tr>
+        <w:trPr>
+          <w:cantSplit/>
+        </w:trPr>
+        <w:tc>
+          <w:tcPr>
+            <w:tcW w:w="4400" w:type="dxa"/>
+            <w:shd w:val="clear" w:color="auto" w:fill="D9D9D9"/>
+            <w:vAlign w:val="center"/>
+          </w:tcPr>
+          <w:p>
+            <w:pPr>
+              <w:spacing w:before="0" w:after="0" w:line="240" w:lineRule="auto"/>
+              <w:jc w:val="left"/>
+            </w:pPr>
+            <w:r>
+              <w:rPr>
+                <w:rFonts w:ascii="Arial" w:hAnsi="Arial" w:cs="Arial"/>
+                <w:b/>
+                <w:sz w:val="15"/>
+                <w:szCs w:val="15"/>
+              </w:rPr>
+              <w:t xml:space="preserve">Indicated Value (rounded to $5,000)</w:t>
+            </w:r>
+          </w:p>
+        </w:tc>
+        <w:tc>
+          <w:tcPr>
+            <w:tcW w:w="1200" w:type="dxa"/>
+            <w:shd w:val="clear" w:color="auto" w:fill="D9D9D9"/>
+            <w:vAlign w:val="center"/>
+          </w:tcPr>
+          <w:p>
+            <w:pPr>
+              <w:spacing w:before="0" w:after="0" w:line="240" w:lineRule="auto"/>
+              <w:jc w:val="right"/>
+            </w:pPr>
+            <w:r>
+              <w:rPr>
+                <w:rFonts w:ascii="Arial" w:hAnsi="Arial" w:cs="Arial"/>
+                <w:b/>
+                <w:sz w:val="15"/>
+                <w:szCs w:val="15"/>
+              </w:rPr>
+              <w:t xml:space="preserve"/>
+            </w:r>
+          </w:p>
+        </w:tc>
+        <w:tc>
+          <w:tcPr>
+            <w:tcW w:w="1500" w:type="dxa"/>
+            <w:shd w:val="clear" w:color="auto" w:fill="D9D9D9"/>
+            <w:vAlign w:val="center"/>
+          </w:tcPr>
+          <w:p>
+            <w:pPr>
+              <w:spacing w:before="0" w:after="0" w:line="240" w:lineRule="auto"/>
+              <w:jc w:val="right"/>
+            </w:pPr>
+            <w:r>
+              <w:rPr>
+                <w:rFonts w:ascii="Arial" w:hAnsi="Arial" w:cs="Arial"/>
+                <w:b/>
+                <w:sz w:val="15"/>
+                <w:szCs w:val="15"/>
+                <w:highlight w:val="yellow"/>
+              </w:rPr>
+              <w:t xml:space="preserve">$470,000</w:t>
+            </w:r>
+          </w:p>
+        </w:tc>
+        <w:tc>
+          <w:tcPr>
+            <w:tcW w:w="1200" w:type="dxa"/>
+            <w:shd w:val="clear" w:color="auto" w:fill="D9D9D9"/>
+            <w:vAlign w:val="center"/>
+          </w:tcPr>
+          <w:p>
+            <w:pPr>
+              <w:spacing w:before="0" w:after="0" w:line="240" w:lineRule="auto"/>
+              <w:jc w:val="right"/>
+            </w:pPr>
+            <w:r>
+              <w:rPr>
+                <w:rFonts w:ascii="Arial" w:hAnsi="Arial" w:cs="Arial"/>
+                <w:b/>
+                <w:sz w:val="15"/>
+                <w:szCs w:val="15"/>
+              </w:rPr>
+              <w:t xml:space="preserve">$167.86</w:t>
+            </w:r>
+          </w:p>
+        </w:tc>
+      </w:tr>
+      <w:tr>
+        <w:trPr>
+          <w:cantSplit/>
+        </w:trPr>
+        <w:tc>
+          <w:tcPr>
+            <w:tcW w:w="8300" w:type="dxa"/>
+            <w:gridSpan w:val="4"/>
+            <w:vAlign w:val="center"/>
+          </w:tcPr>
+          <w:p>
+            <w:pPr>
+              <w:spacing w:before="0" w:after="0" w:line="240" w:lineRule="auto"/>
+              <w:jc w:val="left"/>
+            </w:pPr>
+            <w:r>
+              <w:rPr>
+                <w:rFonts w:ascii="Arial" w:hAnsi="Arial" w:cs="Arial"/>
+                <w:i/>
+                <w:sz w:val="13"/>
+                <w:szCs w:val="13"/>
+              </w:rPr>
+              <w:t xml:space="preserve">Vacancy-period expenses: real estate taxes $25,658 ($9.16/SF, assessor value x 25% x 103.788 mills) plus $4.00/SF other; cap rate supported by CoStar Denver Metro 2,500-15,000 SF industrial average of approx. 5.9% (2024 Q2) and the 5.08% actual rate at Sale 7 (2022).</w:t>
+            </w:r>
+          </w:p>
+        </w:tc>
+      </w:tr>
+    </w:tbl>
     <w:p>
       <w:pPr>
         <w:spacing w:before="120"/>
@@ -19005,11 +23747,7 @@
           <w:sz w:val="22"/>
           <w:szCs w:val="22"/>
         </w:rPr>
-        <w:t>The Income Capitalization Approach was also considered and developed. Sufficient comparable leases were available to support a stabilized rental rate for the property, and third</w:t>
-        <w:noBreakHyphen/>
-        <w:t>party market data was used to determine an appropriate vacancy rate and capitalization rate. While the income approach provides useful secondary support for value, it is given less emphasis than the Sales Comparison Approach due to the subject’s owner</w:t>
-        <w:noBreakHyphen/>
-        <w:t>user appeal.</w:t>
+        <w:t xml:space="preserve">The Income Capitalization Approach was also considered and developed. Sufficient comparable leases were available to support a stabilized market rent of $14.00 per square foot NNN, and third-party market data was used to determine an appropriate vacancy rate and capitalization rate. The resulting indication of $470,000 ($167.86 per square foot) is well below the sales comparison indication, reflecting that small owner-user industrial buildings such as the subject trade at prices well above their capitalized rental income; the owner’s actual 2024 net operating income ($29,815) is consistent with the market NOI used. Because the most probable buyer is an owner-user rather than an investor, the income approach is given no direct weight and is considered as secondary support only.</w:t>
       </w:r>
     </w:p>
     <w:p>
@@ -19221,9 +23959,8 @@
                 <w:rFonts w:ascii="Arial" w:hAnsi="Arial" w:cs="Arial"/>
                 <w:sz w:val="16"/>
                 <w:szCs w:val="16"/>
-                <w:highlight w:val="yellow"/>
-              </w:rPr>
-              <w:t xml:space="preserve">Pending</w:t>
+              </w:rPr>
+              <w:t xml:space="preserve">$470,000</w:t>
             </w:r>
           </w:p>
         </w:tc>

</xml_diff>